<commit_message>
Mémoire : audit de forme et renvois aux illustrations
Forme (incohérences issues de copier-coller) :
- interligne ramené à 1,5 sur 28 paragraphes (1,15 et 1,0 constatés)
- alinéa aligné sur 567 (4 paragraphes en 644 ou 424)
- police TimesNewRomanPSMT renommée Times New Roman (45 occurrences)
- résidu Markdown **SDN_CTRLML** supprimé
- terminologie Cloud-Edge harmonisée (5 demi-cadratins)
- taille isolée 11 pt ramenée à 12 pt

Fond :
- 20 renvois ajoutés : 15 figures et 5 tableaux n'étaient jamais appelés dans le
  corps du texte, ce qu'un jury relève. Phrases rédigées une à une.

86 pages.
</commit_message>
<xml_diff>
--- a/docs/Optimisation de l'architecture SDN.docx
+++ b/docs/Optimisation de l'architecture SDN.docx
@@ -2528,7 +2528,7 @@
     </w:p>
     <w:p>
       <w:pPr>
-        <w:ind w:left="284" w:firstLine="424"/>
+        <w:ind w:left="284" w:firstLine="567"/>
       </w:pPr>
       <w:r>
         <w:t>Dans ce chapitre, nous allons parcourir tour à tour de la généralité de l’architecture SDN et la généralité des infrastructures Cloud Edge.</w:t>
@@ -2550,8 +2550,8 @@
     <w:p>
       <w:pPr>
         <w:pStyle w:val="Titre2"/>
-        <w:spacing w:before="100" w:beforeAutospacing="1" w:after="100" w:afterAutospacing="1" w:line="276" w:lineRule="auto"/>
-        <w:ind w:firstLine="644"/>
+        <w:spacing w:before="100" w:beforeAutospacing="1" w:after="100" w:afterAutospacing="1"/>
+        <w:ind w:firstLine="567"/>
       </w:pPr>
       <w:r>
         <w:t>Définition du SDN</w:t>
@@ -2573,8 +2573,8 @@
     </w:p>
     <w:p>
       <w:pPr>
-        <w:spacing w:before="100" w:beforeAutospacing="1" w:after="100" w:afterAutospacing="1" w:line="276" w:lineRule="auto"/>
-        <w:ind w:firstLine="644"/>
+        <w:spacing w:before="100" w:beforeAutospacing="1" w:after="100" w:afterAutospacing="1"/>
+        <w:ind w:firstLine="567"/>
       </w:pPr>
       <w:r>
         <w:rPr>
@@ -2619,8 +2619,8 @@
     </w:p>
     <w:p>
       <w:pPr>
-        <w:spacing w:before="100" w:beforeAutospacing="1" w:after="100" w:afterAutospacing="1" w:line="276" w:lineRule="auto"/>
-        <w:ind w:firstLine="644"/>
+        <w:spacing w:before="100" w:beforeAutospacing="1" w:after="100" w:afterAutospacing="1"/>
+        <w:ind w:firstLine="567"/>
       </w:pPr>
       <w:r>
         <w:rPr>
@@ -3019,6 +3019,11 @@
     </w:p>
     <w:p>
       <w:r>
+        <w:t xml:space="preserve">La figure 3 situe les trois plans de l’architecture SDN et les interfaces qui les relient.</w:t>
+      </w:r>
+    </w:p>
+    <w:p>
+      <w:r>
         <w:rPr>
           <w:noProof/>
         </w:rPr>
@@ -3105,7 +3110,7 @@
     <w:p>
       <w:r>
         <w:rPr>
-          <w:rFonts w:ascii="TimesNewRomanPSMT" w:hAnsi="TimesNewRomanPSMT" w:cs="TimesNewRomanPSMT"/>
+          <w:rFonts w:ascii="Times New Roman" w:hAnsi="Times New Roman" w:cs="Times New Roman"/>
           <w:szCs w:val="24"/>
         </w:rPr>
         <w:t xml:space="preserve">L’architecture openflow est l’implémentation réelle des réseaux SDN, Cette architecture est basée principalement sur trois composantes : le plan de données, qui est composée des switches openflow ; le plan de contrôle, constitué par des contrôleurs OpenFlow ; une chaîne sécurisée qui permettent aux commutateurs de se connecter au plan de contrôle [3]. </w:t>
@@ -3482,6 +3487,11 @@
           <w:lang w:eastAsia="fr-FR"/>
         </w:rPr>
         <w:t>Architecture à deux couches mélangeant les architectures distribuée et hiérarchique. Le plan de contrôle consiste en plusieurs contrôleurs racine à la couche supérieure. Chacun des racines gère plusieurs contrôleurs locaux qui sont en charge de leurs sites respectifs. Ces contrôleurs racine sont organisés de manière distribuée, recueillant des informations sur l'état global du réseau parmi eux.</w:t>
+      </w:r>
+    </w:p>
+    <w:p>
+      <w:r>
+        <w:t xml:space="preserve">Les principales architectures du SDN sont représentées sur la figure 5.</w:t>
       </w:r>
     </w:p>
     <w:p>
@@ -3557,7 +3567,7 @@
     </w:p>
     <w:p>
       <w:pPr>
-        <w:spacing w:line="276" w:lineRule="auto"/>
+        <w:spacing/>
         <w:rPr>
           <w:rFonts w:cs="Times New Roman"/>
           <w:szCs w:val="24"/>
@@ -3574,7 +3584,7 @@
     </w:p>
     <w:p>
       <w:pPr>
-        <w:spacing w:line="276" w:lineRule="auto"/>
+        <w:spacing/>
         <w:rPr>
           <w:rFonts w:cs="Times New Roman"/>
           <w:szCs w:val="24"/>
@@ -3595,7 +3605,7 @@
           <w:ilvl w:val="0"/>
           <w:numId w:val="7"/>
         </w:numPr>
-        <w:spacing w:line="276" w:lineRule="auto"/>
+        <w:spacing/>
         <w:rPr>
           <w:rFonts w:cs="Times New Roman"/>
           <w:b/>
@@ -3615,7 +3625,7 @@
     </w:p>
     <w:p>
       <w:pPr>
-        <w:spacing w:line="276" w:lineRule="auto"/>
+        <w:spacing/>
         <w:rPr>
           <w:rFonts w:cs="Times New Roman"/>
           <w:szCs w:val="24"/>
@@ -3638,7 +3648,7 @@
           <w:ilvl w:val="0"/>
           <w:numId w:val="7"/>
         </w:numPr>
-        <w:spacing w:line="276" w:lineRule="auto"/>
+        <w:spacing/>
         <w:rPr>
           <w:rFonts w:cs="Times New Roman"/>
           <w:b/>
@@ -3658,7 +3668,7 @@
     </w:p>
     <w:p>
       <w:pPr>
-        <w:spacing w:line="276" w:lineRule="auto"/>
+        <w:spacing/>
         <w:rPr>
           <w:rFonts w:cs="Times New Roman"/>
           <w:szCs w:val="24"/>
@@ -3679,7 +3689,7 @@
           <w:ilvl w:val="0"/>
           <w:numId w:val="7"/>
         </w:numPr>
-        <w:spacing w:line="276" w:lineRule="auto"/>
+        <w:spacing/>
         <w:rPr>
           <w:rFonts w:cs="Times New Roman"/>
           <w:b/>
@@ -3699,7 +3709,7 @@
     </w:p>
     <w:p>
       <w:pPr>
-        <w:spacing w:line="276" w:lineRule="auto"/>
+        <w:spacing/>
         <w:rPr>
           <w:rFonts w:cs="Times New Roman"/>
           <w:szCs w:val="24"/>
@@ -3720,7 +3730,7 @@
           <w:ilvl w:val="0"/>
           <w:numId w:val="7"/>
         </w:numPr>
-        <w:spacing w:line="276" w:lineRule="auto"/>
+        <w:spacing/>
         <w:rPr>
           <w:rFonts w:cs="Times New Roman"/>
           <w:b/>
@@ -3740,7 +3750,7 @@
     </w:p>
     <w:p>
       <w:pPr>
-        <w:spacing w:line="276" w:lineRule="auto"/>
+        <w:spacing/>
         <w:rPr>
           <w:rFonts w:cs="Times New Roman"/>
           <w:szCs w:val="24"/>
@@ -3756,7 +3766,7 @@
     </w:p>
     <w:p>
       <w:pPr>
-        <w:spacing w:line="276" w:lineRule="auto"/>
+        <w:spacing/>
         <w:rPr>
           <w:rFonts w:cs="Times New Roman"/>
           <w:szCs w:val="24"/>
@@ -3772,7 +3782,7 @@
     </w:p>
     <w:p>
       <w:pPr>
-        <w:spacing w:line="276" w:lineRule="auto"/>
+        <w:spacing/>
         <w:rPr>
           <w:rFonts w:cs="Times New Roman"/>
           <w:szCs w:val="24"/>
@@ -3859,7 +3869,7 @@
     </w:p>
     <w:p>
       <w:pPr>
-        <w:spacing w:line="276" w:lineRule="auto"/>
+        <w:spacing/>
         <w:rPr>
           <w:rFonts w:cs="Times New Roman"/>
           <w:szCs w:val="24"/>
@@ -4226,13 +4236,13 @@
     <w:p>
       <w:pPr>
         <w:rPr>
-          <w:rFonts w:ascii="TimesNewRomanPSMT" w:hAnsi="TimesNewRomanPSMT" w:cs="TimesNewRomanPSMT"/>
+          <w:rFonts w:ascii="Times New Roman" w:hAnsi="Times New Roman" w:cs="Times New Roman"/>
           <w:szCs w:val="24"/>
         </w:rPr>
       </w:pPr>
       <w:r>
         <w:rPr>
-          <w:rFonts w:ascii="TimesNewRomanPSMT" w:hAnsi="TimesNewRomanPSMT" w:cs="TimesNewRomanPSMT"/>
+          <w:rFonts w:ascii="Times New Roman" w:hAnsi="Times New Roman" w:cs="Times New Roman"/>
           <w:szCs w:val="24"/>
         </w:rPr>
         <w:lastRenderedPageBreak/>
@@ -4242,13 +4252,13 @@
     <w:p>
       <w:pPr>
         <w:rPr>
-          <w:rFonts w:ascii="TimesNewRomanPSMT" w:hAnsi="TimesNewRomanPSMT" w:cs="TimesNewRomanPSMT"/>
+          <w:rFonts w:ascii="Times New Roman" w:hAnsi="Times New Roman" w:cs="Times New Roman"/>
           <w:szCs w:val="24"/>
         </w:rPr>
       </w:pPr>
       <w:r>
         <w:rPr>
-          <w:rFonts w:ascii="TimesNewRomanPSMT" w:hAnsi="TimesNewRomanPSMT" w:cs="TimesNewRomanPSMT"/>
+          <w:rFonts w:ascii="Times New Roman" w:hAnsi="Times New Roman" w:cs="Times New Roman"/>
           <w:szCs w:val="24"/>
         </w:rPr>
         <w:t>Dans les architectures réseau cellulaire, les serveurs sont déployés à proximité de chaque station de base (BS). Les utilisateurs utilisent alors les ressources fournies par les serveurs situés dans la cellule à laquelle ils sont connectés. Ces serveurs effectuent les calculs nécessitant un temps de réponse faibles et en transmettent au Cloud ceux qui nécessitent des ressources plus conséquentes. Une telle architecture est également utile lors du stockage de données et le passage rapide des demandes de l’utilisateur au serveur situé en périphérie du réseau. Si ce réseau ne dispose pas la ressource demandée, la requête est transmise à l'infrastructure Cloud. Lorsque les données sont renvoyées par le Cloud, elles sont mises en cache afin de pouvoir répondre directement aux futures requêtes. Les serveurs situés à la périphérie du réseau ont des ressources moins importantes que celles du Cloud mais suffisantes pour effectuer certains calculs ayant besoin d’une faible latence [12].</w:t>
@@ -4262,7 +4272,7 @@
           <w:numId w:val="10"/>
         </w:numPr>
         <w:rPr>
-          <w:rFonts w:ascii="TimesNewRomanPSMT" w:hAnsi="TimesNewRomanPSMT" w:cs="TimesNewRomanPSMT"/>
+          <w:rFonts w:ascii="Times New Roman" w:hAnsi="Times New Roman" w:cs="Times New Roman"/>
           <w:b/>
           <w:bCs/>
           <w:color w:val="1F4E79" w:themeColor="accent5" w:themeShade="80"/>
@@ -4272,7 +4282,7 @@
       </w:pPr>
       <w:r>
         <w:rPr>
-          <w:rFonts w:ascii="TimesNewRomanPSMT" w:hAnsi="TimesNewRomanPSMT" w:cs="TimesNewRomanPSMT"/>
+          <w:rFonts w:ascii="Times New Roman" w:hAnsi="Times New Roman" w:cs="Times New Roman"/>
           <w:b/>
           <w:bCs/>
           <w:color w:val="1F4E79" w:themeColor="accent5" w:themeShade="80"/>
@@ -4302,7 +4312,7 @@
           <w:numId w:val="10"/>
         </w:numPr>
         <w:rPr>
-          <w:rFonts w:ascii="TimesNewRomanPSMT" w:hAnsi="TimesNewRomanPSMT" w:cs="TimesNewRomanPSMT"/>
+          <w:rFonts w:ascii="Times New Roman" w:hAnsi="Times New Roman" w:cs="Times New Roman"/>
           <w:b/>
           <w:bCs/>
           <w:color w:val="1F4E79" w:themeColor="accent5" w:themeShade="80"/>
@@ -4311,7 +4321,7 @@
       </w:pPr>
       <w:r>
         <w:rPr>
-          <w:rFonts w:ascii="TimesNewRomanPSMT" w:hAnsi="TimesNewRomanPSMT" w:cs="TimesNewRomanPSMT"/>
+          <w:rFonts w:ascii="Times New Roman" w:hAnsi="Times New Roman" w:cs="Times New Roman"/>
           <w:b/>
           <w:bCs/>
           <w:color w:val="1F4E79" w:themeColor="accent5" w:themeShade="80"/>
@@ -4337,7 +4347,7 @@
     <w:p>
       <w:pPr>
         <w:rPr>
-          <w:rFonts w:ascii="TimesNewRomanPSMT" w:hAnsi="TimesNewRomanPSMT" w:cs="TimesNewRomanPSMT"/>
+          <w:rFonts w:ascii="Times New Roman" w:hAnsi="Times New Roman" w:cs="Times New Roman"/>
           <w:szCs w:val="24"/>
         </w:rPr>
       </w:pPr>
@@ -4352,7 +4362,7 @@
       <w:pPr>
         <w:ind w:firstLine="0"/>
         <w:rPr>
-          <w:rFonts w:ascii="TimesNewRomanPSMT" w:hAnsi="TimesNewRomanPSMT" w:cs="TimesNewRomanPSMT"/>
+          <w:rFonts w:ascii="Times New Roman" w:hAnsi="Times New Roman" w:cs="Times New Roman"/>
           <w:szCs w:val="24"/>
         </w:rPr>
       </w:pPr>
@@ -4361,7 +4371,7 @@
       <w:pPr>
         <w:pStyle w:val="Titre2"/>
         <w:rPr>
-          <w:rFonts w:ascii="TimesNewRomanPSMT" w:hAnsi="TimesNewRomanPSMT" w:cs="TimesNewRomanPSMT"/>
+          <w:rFonts w:ascii="Times New Roman" w:hAnsi="Times New Roman" w:cs="Times New Roman"/>
           <w:szCs w:val="24"/>
         </w:rPr>
       </w:pPr>
@@ -4372,16 +4382,21 @@
     <w:p>
       <w:pPr>
         <w:rPr>
-          <w:rFonts w:ascii="TimesNewRomanPSMT" w:hAnsi="TimesNewRomanPSMT" w:cs="TimesNewRomanPSMT"/>
+          <w:rFonts w:ascii="Times New Roman" w:hAnsi="Times New Roman" w:cs="Times New Roman"/>
           <w:szCs w:val="24"/>
         </w:rPr>
       </w:pPr>
     </w:p>
     <w:p>
+      <w:r>
+        <w:t xml:space="preserve">La figure 6 illustre le déchargement des traitements vers le serveur Edge.</w:t>
+      </w:r>
+    </w:p>
+    <w:p>
       <w:pPr>
         <w:ind w:firstLine="0"/>
         <w:rPr>
-          <w:rFonts w:ascii="TimesNewRomanPSMT" w:hAnsi="TimesNewRomanPSMT" w:cs="TimesNewRomanPSMT"/>
+          <w:rFonts w:ascii="Times New Roman" w:hAnsi="Times New Roman" w:cs="Times New Roman"/>
           <w:szCs w:val="24"/>
         </w:rPr>
       </w:pPr>
@@ -4575,10 +4590,15 @@
       </w:pPr>
     </w:p>
     <w:p>
+      <w:r>
+        <w:t xml:space="preserve">L’organisation générale de l’Edge Computing est représentée sur la figure 7.</w:t>
+      </w:r>
+    </w:p>
+    <w:p>
       <w:pPr>
         <w:ind w:firstLine="0"/>
         <w:rPr>
-          <w:rFonts w:ascii="TimesNewRomanPSMT" w:hAnsi="TimesNewRomanPSMT" w:cs="TimesNewRomanPSMT"/>
+          <w:rFonts w:ascii="Times New Roman" w:hAnsi="Times New Roman" w:cs="Times New Roman"/>
           <w:szCs w:val="24"/>
         </w:rPr>
       </w:pPr>
@@ -4625,7 +4645,7 @@
     </w:p>
     <w:p>
       <w:pPr>
-        <w:spacing w:line="276" w:lineRule="auto"/>
+        <w:spacing/>
         <w:rPr>
           <w:rFonts w:cs="Times New Roman"/>
           <w:szCs w:val="24"/>
@@ -4649,7 +4669,7 @@
     </w:p>
     <w:p>
       <w:pPr>
-        <w:spacing w:line="276" w:lineRule="auto"/>
+        <w:spacing/>
         <w:rPr>
           <w:rFonts w:cs="Times New Roman"/>
           <w:szCs w:val="24"/>
@@ -4658,7 +4678,7 @@
     </w:p>
     <w:p>
       <w:pPr>
-        <w:spacing w:line="276" w:lineRule="auto"/>
+        <w:spacing/>
         <w:rPr>
           <w:rFonts w:cs="Times New Roman"/>
           <w:szCs w:val="24"/>
@@ -5578,7 +5598,7 @@
           <w:numId w:val="16"/>
         </w:numPr>
         <w:rPr>
-          <w:sz w:val="22"/>
+          <w:sz w:val="24"/>
           <w:szCs w:val="20"/>
         </w:rPr>
       </w:pPr>
@@ -5594,7 +5614,7 @@
         <w:rPr>
           <w:b/>
           <w:bCs/>
-          <w:sz w:val="22"/>
+          <w:sz w:val="24"/>
           <w:szCs w:val="20"/>
         </w:rPr>
         <w:t xml:space="preserve">: </w:t>
@@ -5744,7 +5764,7 @@
         <w:autoSpaceDE w:val="0"/>
         <w:autoSpaceDN w:val="0"/>
         <w:adjustRightInd w:val="0"/>
-        <w:spacing w:after="0" w:line="240" w:lineRule="auto"/>
+        <w:spacing w:after="0"/>
         <w:ind w:firstLine="0"/>
         <w:jc w:val="left"/>
         <w:rPr>
@@ -5757,7 +5777,7 @@
     </w:p>
     <w:p>
       <w:pPr>
-        <w:spacing w:line="276" w:lineRule="auto"/>
+        <w:spacing/>
         <w:rPr>
           <w:rFonts w:cs="Times New Roman"/>
           <w:color w:val="EE0000"/>
@@ -5778,7 +5798,7 @@
         <w:autoSpaceDE w:val="0"/>
         <w:autoSpaceDN w:val="0"/>
         <w:adjustRightInd w:val="0"/>
-        <w:spacing w:after="0" w:line="240" w:lineRule="auto"/>
+        <w:spacing w:after="0"/>
         <w:ind w:firstLine="0"/>
         <w:jc w:val="left"/>
       </w:pPr>
@@ -5866,7 +5886,7 @@
           <w:sz w:val="28"/>
           <w:szCs w:val="24"/>
         </w:rPr>
-        <w:t>Comment optimiser dynamiquement une architecture SDN décentralisée dans un environnement Cloud–Edge distribué en utilisant des techniques de Machine Learning afin d’améliorer les performances réseau ?</w:t>
+        <w:t>Comment optimiser dynamiquement une architecture SDN décentralisée dans un environnement Cloud-Edge distribué en utilisant des techniques de Machine Learning afin d’améliorer les performances réseau ?</w:t>
       </w:r>
     </w:p>
     <w:p>
@@ -5887,7 +5907,7 @@
     </w:p>
     <w:p>
       <w:r>
-        <w:t>Concevoir et évaluer un système d'optimisation dynamique d'une architecture SDN décentralisée dans un environnement Cloud–Edge distribué, en exploitant des techniques de Machine Learning pour améliorer les performances réseau.</w:t>
+        <w:t>Concevoir et évaluer un système d'optimisation dynamique d'une architecture SDN décentralisée dans un environnement Cloud-Edge distribué, en exploitant des techniques de Machine Learning pour améliorer les performances réseau.</w:t>
       </w:r>
     </w:p>
     <w:p>
@@ -5902,7 +5922,7 @@
         </w:rPr>
       </w:pPr>
       <w:r>
-        <w:t>1. Analyser les limites des architectures SDN existantes en environnement Cloud–Edge</w:t>
+        <w:t>1. Analyser les limites des architectures SDN existantes en environnement Cloud-Edge</w:t>
       </w:r>
     </w:p>
     <w:p>
@@ -5995,7 +6015,7 @@
         <w:pStyle w:val="Titre5"/>
       </w:pPr>
       <w:r>
-        <w:t>2. Modéliser l'architecture SDN décentralisée Cloud–Edge</w:t>
+        <w:t>2. Modéliser l'architecture SDN décentralisée Cloud-Edge</w:t>
       </w:r>
     </w:p>
     <w:p>
@@ -6364,7 +6384,7 @@
         <w:pStyle w:val="Titre5"/>
       </w:pPr>
       <w:r>
-        <w:t>6. Réduire la latence de bout en bout dans l'environnement Cloud–Edge</w:t>
+        <w:t>6. Réduire la latence de bout en bout dans l'environnement Cloud-Edge</w:t>
       </w:r>
     </w:p>
     <w:p>
@@ -8739,7 +8759,7 @@
     </w:p>
     <w:p>
       <w:pPr>
-        <w:spacing w:before="100" w:beforeAutospacing="1" w:after="100" w:afterAutospacing="1" w:line="240" w:lineRule="auto"/>
+        <w:spacing w:before="100" w:beforeAutospacing="1" w:after="100" w:afterAutospacing="1"/>
         <w:ind w:firstLine="0"/>
         <w:jc w:val="left"/>
         <w:rPr>
@@ -8897,7 +8917,7 @@
     </w:p>
     <w:p>
       <w:pPr>
-        <w:spacing w:line="276" w:lineRule="auto"/>
+        <w:spacing/>
         <w:rPr>
           <w:rFonts w:cs="Times New Roman"/>
           <w:szCs w:val="24"/>
@@ -8908,7 +8928,7 @@
           <w:rFonts w:cs="Times New Roman"/>
           <w:szCs w:val="24"/>
         </w:rPr>
-        <w:t>Cet article introduit **SDN_CTRLML**, une nouvelle architecture pour contrôleurs distribués qui utilise des approches d’apprentissage automatique IA pour l’équilibrage de charge. SDN_CTRLML assure l’équilibrage de charge entre contrôleurs grâce à une couche de planification qui permet l’association commutateur-contrôleur sans liaisons fixes. Cela permet aux commutateurs d’envoyer des messages à différents contrôleurs en fonction des algorithmes de planification sans interrompre la ré-association des commutateurs. Cela permet de maintenir les performances du réseau et de minimiser les délais globaux.</w:t>
+        <w:t>Cet article introduit SDN_CTRLML, une nouvelle architecture pour contrôleurs distribués qui utilise des approches d’apprentissage automatique IA pour l’équilibrage de charge. SDN_CTRLML assure l’équilibrage de charge entre contrôleurs grâce à une couche de planification qui permet l’association commutateur-contrôleur sans liaisons fixes. Cela permet aux commutateurs d’envoyer des messages à différents contrôleurs en fonction des algorithmes de planification sans interrompre la ré-association des commutateurs. Cela permet de maintenir les performances du réseau et de minimiser les délais globaux.</w:t>
       </w:r>
     </w:p>
     <w:p>
@@ -9048,7 +9068,7 @@
     </w:p>
     <w:p>
       <w:pPr>
-        <w:spacing w:before="100" w:beforeAutospacing="1" w:after="100" w:afterAutospacing="1" w:line="240" w:lineRule="auto"/>
+        <w:spacing w:before="100" w:beforeAutospacing="1" w:after="100" w:afterAutospacing="1"/>
         <w:ind w:firstLine="0"/>
         <w:jc w:val="left"/>
         <w:rPr>
@@ -9104,7 +9124,7 @@
     </w:p>
     <w:p>
       <w:pPr>
-        <w:spacing w:before="100" w:beforeAutospacing="1" w:after="100" w:afterAutospacing="1" w:line="240" w:lineRule="auto"/>
+        <w:spacing w:before="100" w:beforeAutospacing="1" w:after="100" w:afterAutospacing="1"/>
         <w:ind w:firstLine="0"/>
         <w:jc w:val="left"/>
         <w:rPr>
@@ -9142,7 +9162,7 @@
     </w:p>
     <w:p>
       <w:pPr>
-        <w:spacing w:before="100" w:beforeAutospacing="1" w:after="100" w:afterAutospacing="1" w:line="240" w:lineRule="auto"/>
+        <w:spacing w:before="100" w:beforeAutospacing="1" w:after="100" w:afterAutospacing="1"/>
         <w:ind w:firstLine="0"/>
         <w:jc w:val="left"/>
         <w:rPr>
@@ -9199,7 +9219,7 @@
     </w:p>
     <w:p>
       <w:pPr>
-        <w:spacing w:before="100" w:beforeAutospacing="1" w:after="100" w:afterAutospacing="1" w:line="240" w:lineRule="auto"/>
+        <w:spacing w:before="100" w:beforeAutospacing="1" w:after="100" w:afterAutospacing="1"/>
         <w:ind w:firstLine="0"/>
         <w:jc w:val="left"/>
         <w:rPr>
@@ -11221,6 +11241,11 @@
         <w:t xml:space="preserve"> </w:t>
       </w:r>
     </w:p>
+    <w:p>
+      <w:r>
+        <w:t xml:space="preserve">Le tableau 3 précise l’interprétation retenue pour chaque cluster de charge.</w:t>
+      </w:r>
+    </w:p>
     <w:tbl>
       <w:tblPr>
         <w:tblStyle w:val="Grilledutableau"/>
@@ -11790,6 +11815,11 @@
       </w:r>
     </w:p>
     <w:p>
+      <w:r>
+        <w:t xml:space="preserve">La figure 9 schématise cette prise de décision.</w:t>
+      </w:r>
+    </w:p>
+    <w:p>
       <w:pPr>
         <w:jc w:val="center"/>
       </w:pPr>
@@ -11948,6 +11978,11 @@
       </w:r>
     </w:p>
     <w:p>
+      <w:r>
+        <w:t xml:space="preserve">Le logigramme de la figure 10 détaille la règle à deux régimes telle qu’elle est implémentée.</w:t>
+      </w:r>
+    </w:p>
+    <w:p>
       <w:pPr>
         <w:jc w:val="center"/>
       </w:pPr>
@@ -12325,7 +12360,7 @@
         <w:t xml:space="preserve">Internet Topology Zoo </w:t>
       </w:r>
       <w:r>
-        <w:t>(topology-zoo.org) : plus de 250 topologies réelles d'opérateurs au format GraphML avec coordonnées géographiques, utilisées pour construire la topologie réseau et les latences commutateur–contrôleur (plus court chemin, NetworkX).</w:t>
+        <w:t>(topology-zoo.org) : plus de 250 topologies réelles d'opérateurs au format GraphML avec coordonnées géographiques, utilisées pour construire la topologie réseau et les latences commutateur-contrôleur (plus court chemin, NetworkX).</w:t>
       </w:r>
     </w:p>
     <w:p>
@@ -12341,6 +12376,11 @@
           <w:u w:val="single"/>
         </w:rPr>
         <w:t>Plan d'expériences (Design of Experiments)</w:t>
+      </w:r>
+    </w:p>
+    <w:p>
+      <w:r>
+        <w:t xml:space="preserve">La figure 11 récapitule le pipeline expérimental complet, des données au protocole statistique.</w:t>
       </w:r>
     </w:p>
     <w:p>
@@ -12447,6 +12487,11 @@
         <w:t>Environnement matériel et logiciel</w:t>
       </w:r>
     </w:p>
+    <w:p>
+      <w:r>
+        <w:t xml:space="preserve">Le tableau 4 décrit l’environnement matériel et logiciel des expériences.</w:t>
+      </w:r>
+    </w:p>
     <w:tbl>
       <w:tblPr>
         <w:tblStyle w:val="Grilledutableau"/>
@@ -12680,6 +12725,11 @@
           <w:u w:val="single"/>
         </w:rPr>
         <w:t>Bibliothèques Python</w:t>
+      </w:r>
+    </w:p>
+    <w:p>
+      <w:r>
+        <w:t xml:space="preserve">Les bibliothèques employées sont listées dans le tableau 5.</w:t>
       </w:r>
     </w:p>
     <w:tbl>
@@ -14689,6 +14739,11 @@
           <w:sz w:val="20"/>
         </w:rPr>
         <w:t xml:space="preserve"> : Moyennes globales par stratégie sur les 1 000 exécutions</w:t>
+      </w:r>
+    </w:p>
+    <w:p>
+      <w:r>
+        <w:t xml:space="preserve">La figure 12 compare les moyennes globales de temps de réponse et de débit.</w:t>
       </w:r>
     </w:p>
     <w:p>
@@ -14978,6 +15033,11 @@
       </w:r>
     </w:p>
     <w:p>
+      <w:r>
+        <w:t xml:space="preserve">La figure 14 rapporte le débit servi en fonction du taux d’arrivée.</w:t>
+      </w:r>
+    </w:p>
+    <w:p>
       <w:pPr>
         <w:ind w:firstLine="0"/>
         <w:jc w:val="center"/>
@@ -15075,6 +15135,11 @@
       </w:r>
     </w:p>
     <w:p>
+      <w:r>
+        <w:t xml:space="preserve">La figure 15 rapporte l’indice d’équité de Jain en fonction du taux d’arrivée.</w:t>
+      </w:r>
+    </w:p>
+    <w:p>
       <w:pPr>
         <w:ind w:firstLine="0"/>
         <w:jc w:val="center"/>
@@ -15177,6 +15242,11 @@
       </w:r>
     </w:p>
     <w:p>
+      <w:r>
+        <w:t xml:space="preserve">La figure 16 rapporte l’utilisation CPU moyenne des contrôleurs.</w:t>
+      </w:r>
+    </w:p>
+    <w:p>
       <w:pPr>
         <w:ind w:firstLine="0"/>
         <w:jc w:val="center"/>
@@ -15274,6 +15344,11 @@
       </w:r>
     </w:p>
     <w:p>
+      <w:r>
+        <w:t xml:space="preserve">La figure 17 rapporte le nombre de réaffectations en fonction du taux d’arrivée.</w:t>
+      </w:r>
+    </w:p>
+    <w:p>
       <w:pPr>
         <w:ind w:firstLine="0"/>
         <w:jc w:val="center"/>
@@ -17663,6 +17738,11 @@
         <w:t xml:space="preserve">Les sections précédentes établissent que la stratégie proposée surpasse les références, mais elles ne disent pas quelle brique produit ce gain. Une architecture combinant plusieurs mécanismes peut en effet devoir l’essentiel de ses performances à un seul d’entre eux. Pour lever cette ambiguïté, une étude d’ablation a été conduite : chaque composant est désactivé isolément, toutes choses égales par ailleurs, et l’écart mesuré quantifie sa contribution réelle. Le protocole reprend dix graines aléatoires et trois régimes de charge, soit trente exécutions par variante.</w:t>
       </w:r>
     </w:p>
+    <w:p>
+      <w:r>
+        <w:t xml:space="preserve">Le tableau 9 rassemble les mesures obtenues pour chaque variante.</w:t>
+      </w:r>
+    </w:p>
     <w:tbl>
       <w:tblPr>
         <w:tblStyle w:val="Grilledutableau"/>
@@ -18535,6 +18615,11 @@
           <w:sz w:val="20"/>
         </w:rPr>
         <w:t xml:space="preserve"> : Étude d’ablation : contribution mesurée de chaque composant</w:t>
+      </w:r>
+    </w:p>
+    <w:p>
+      <w:r>
+        <w:t xml:space="preserve">La figure 18 visualise ces écarts composant par composant.</w:t>
       </w:r>
     </w:p>
     <w:p>
@@ -18665,6 +18750,11 @@
         <w:t xml:space="preserve">Le protocole place délibérément l’infrastructure en situation de déséquilibre maximal : au démarrage, tous les commutateurs sont rattachés au même contrôleur, ce qui reproduit le comportement d’une liaison statique. Deux profils de trafic sont éprouvés, l’un constant et l’autre en pics, et la mesure de référence est l’indice de Jain pondéré par la capacité, qui vaut l’unité lorsque chaque contrôleur porte une charge proportionnelle à sa puissance.</w:t>
       </w:r>
     </w:p>
+    <w:p>
+      <w:r>
+        <w:t xml:space="preserve">Le tableau 10 rassemble les résultats des quatre configurations éprouvées.</w:t>
+      </w:r>
+    </w:p>
     <w:tbl>
       <w:tblPr>
         <w:tblStyle w:val="Grilledutableau"/>
@@ -19422,6 +19512,11 @@
           <w:sz w:val="20"/>
         </w:rPr>
         <w:t xml:space="preserve"> : Résultats de l’émulation sur commutateurs Open vSwitch réels</w:t>
+      </w:r>
+    </w:p>
+    <w:p>
+      <w:r>
+        <w:t xml:space="preserve">La figure 19 retrace l’évolution de l’équité au fil des cycles de décision.</w:t>
       </w:r>
     </w:p>
     <w:p>
@@ -19498,6 +19593,11 @@
           <w:sz w:val="20"/>
         </w:rPr>
         <w:t xml:space="preserve"> : Évolution de l’équité au fil des cycles de décision, avec et sans rééquilibrage</w:t>
+      </w:r>
+    </w:p>
+    <w:p>
+      <w:r>
+        <w:t xml:space="preserve">La figure 20 compare la répartition de la charge avant et après rééquilibrage.</w:t>
       </w:r>
     </w:p>
     <w:p>

</xml_diff>

<commit_message>
Mémoire : typographie uniforme et schémas redessinés
- 249 apostrophes droites converties en apostrophes typographiques (elles
  cohabitaient avec 672 apostrophes correctes dans 118 paragraphes).
- Figures 10 et 11 (logigramme et pipeline) redessinées : les versions Graphviz
  employaient une police et une esthétique étrangères au document. Les nouvelles
  reprennent l'empattement et la palette du mémoire.

87 pages.
</commit_message>
<xml_diff>
--- a/docs/Optimisation de l'architecture SDN.docx
+++ b/docs/Optimisation de l'architecture SDN.docx
@@ -2423,7 +2423,7 @@
     </w:p>
     <w:p>
       <w:r>
-        <w:t>Optimisation de l'architecture SDN décentralisée pour une infrastructure distribuée cloud Edge</w:t>
+        <w:t>Optimisation de l’architecture SDN décentralisée pour une infrastructure distribuée cloud Edge</w:t>
       </w:r>
     </w:p>
     <w:p/>
@@ -2471,7 +2471,7 @@
     </w:p>
     <w:p>
       <w:r>
-        <w:t>Parallèlement, le développement fulgurant de l’Internet des Objets Étendu (IoE) accentue ces enjeux. Le nombre d’appareils intelligents connectés à Internet explose, générant des volumes massifs de données à grande échelle. Des domaines variés, tels que les maisons intelligentes et les véhicules autonomes dans les transports, les caméras de surveillance ou encore les robots intelligents en fabrication industrielle, illustrent cette prolifération. Selon les estimations récentes de l’IoT Analytics en octobre 2025, le nombre d'appareils IoT connectés atteint 21,1 milliards en 2025, en croissance de 14 % par rapport à 2024. Cette estimation prévoit une accélération à 39 milliards d'ici 2030. Ce qui amplifie les défis inhérents aux modèles traditionnels de cloud computing centralisé. Ces derniers se heurtent à des problèmes critiques : surcharge de la bande passante, lenteur des temps de réponse, vulnérabilités sécuritaires accrues et insuffisante protection de la vie privée. Le cloud computing classique, bien qu’efficace pour le traitement centralisé à grande échelle, peine désormais à répondre aux exigences d’une société intelligente en perpétuelle évolution, où la rapidité, la fiabilité et la confidentialité des données sont primordiales.</w:t>
+        <w:t>Parallèlement, le développement fulgurant de l’Internet des Objets Étendu (IoE) accentue ces enjeux. Le nombre d’appareils intelligents connectés à Internet explose, générant des volumes massifs de données à grande échelle. Des domaines variés, tels que les maisons intelligentes et les véhicules autonomes dans les transports, les caméras de surveillance ou encore les robots intelligents en fabrication industrielle, illustrent cette prolifération. Selon les estimations récentes de l’IoT Analytics en octobre 2025, le nombre d’appareils IoT connectés atteint 21,1 milliards en 2025, en croissance de 14 % par rapport à 2024. Cette estimation prévoit une accélération à 39 milliards d’ici 2030. Ce qui amplifie les défis inhérents aux modèles traditionnels de cloud computing centralisé. Ces derniers se heurtent à des problèmes critiques : surcharge de la bande passante, lenteur des temps de réponse, vulnérabilités sécuritaires accrues et insuffisante protection de la vie privée. Le cloud computing classique, bien qu’efficace pour le traitement centralisé à grande échelle, peine désormais à répondre aux exigences d’une société intelligente en perpétuelle évolution, où la rapidité, la fiabilité et la confidentialité des données sont primordiales.</w:t>
       </w:r>
     </w:p>
     <w:p>
@@ -2582,7 +2582,7 @@
         </w:rPr>
         <w:drawing>
           <wp:inline distT="0" distB="0" distL="0" distR="0" wp14:anchorId="614AA375" wp14:editId="740FAE43">
-            <wp:extent cx="5760720" cy="2388870"/>
+            <wp:extent cx="5760720" cy="3160774"/>
             <wp:effectExtent l="0" t="0" r="0" b="0"/>
             <wp:docPr id="3" name="Image 3"/>
             <wp:cNvGraphicFramePr>
@@ -2604,7 +2604,7 @@
                   <pic:spPr>
                     <a:xfrm>
                       <a:off x="0" y="0"/>
-                      <a:ext cx="5760720" cy="2388870"/>
+                      <a:ext cx="5760720" cy="3160774"/>
                     </a:xfrm>
                     <a:prstGeom prst="rect">
                       <a:avLst/>
@@ -2702,7 +2702,7 @@
           <w:b/>
           <w:bCs/>
         </w:rPr>
-        <w:t>Permettre au réseau de mieux identifier les applications transportées pour mieux les gérer (QoS, sécurité, …) : le réseau devient capable d'identifier quelle application génère quel trafic et peut adapter son comportement en conséquence.</w:t>
+        <w:t>Permettre au réseau de mieux identifier les applications transportées pour mieux les gérer (QoS, sécurité, …) : le réseau devient capable d’identifier quelle application génère quel trafic et peut adapter son comportement en conséquence.</w:t>
       </w:r>
     </w:p>
     <w:p/>
@@ -2726,7 +2726,7 @@
         <w:jc w:val="both"/>
       </w:pPr>
       <w:r>
-        <w:t>L'ONF (Open Networking Foundation) décrit une architecture de haut niveau du SDN, qui est fonctionnellement et verticalement divisée en trois couches :</w:t>
+        <w:t>L’ONF (Open Networking Foundation) décrit une architecture de haut niveau du SDN, qui est fonctionnellement et verticalement divisée en trois couches :</w:t>
       </w:r>
     </w:p>
     <w:p>
@@ -2931,7 +2931,7 @@
         </w:rPr>
       </w:pPr>
       <w:r>
-        <w:t xml:space="preserve">Un réseau d'entreprise à grande échelle est partitionné en sous-réseaux, où chaque sous-réseau est géré par un contrôleur différent. Dans cette architecture multi-contrôleur, chaque réseau a la vue globale du réseau pour communiquer avec l'autre domaine et échanger la topologie entre les sous-domaines. La communication intra-domaine directe n'est pas possible sans l'aide d'une interface appropriée. Les protocoles est-ouest résolvent ce problème en échangeant la vue du réseau entre les contrôleurs pour synchroniser l’état du réseau. </w:t>
+        <w:t xml:space="preserve">Un réseau d’entreprise à grande échelle est partitionné en sous-réseaux, où chaque sous-réseau est géré par un contrôleur différent. Dans cette architecture multi-contrôleur, chaque réseau a la vue globale du réseau pour communiquer avec l’autre domaine et échanger la topologie entre les sous-domaines. La communication intra-domaine directe n’est pas possible sans l’aide d’une interface appropriée. Les protocoles est-ouest résolvent ce problème en échangeant la vue du réseau entre les contrôleurs pour synchroniser l’état du réseau. </w:t>
       </w:r>
       <w:r>
         <w:rPr>
@@ -2953,7 +2953,7 @@
         </w:rPr>
         <w:drawing>
           <wp:inline distT="0" distB="0" distL="0" distR="0" wp14:anchorId="012E39D2" wp14:editId="00ABAE61">
-            <wp:extent cx="5760720" cy="3350895"/>
+            <wp:extent cx="5760720" cy="3160774"/>
             <wp:effectExtent l="0" t="0" r="0" b="1905"/>
             <wp:docPr id="1" name="Image 1"/>
             <wp:cNvGraphicFramePr>
@@ -2975,7 +2975,7 @@
                   <pic:spPr>
                     <a:xfrm>
                       <a:off x="0" y="0"/>
-                      <a:ext cx="5760720" cy="3350895"/>
+                      <a:ext cx="5760720" cy="3160774"/>
                     </a:xfrm>
                     <a:prstGeom prst="rect">
                       <a:avLst/>
@@ -3029,7 +3029,7 @@
         </w:rPr>
         <w:drawing>
           <wp:inline distT="0" distB="0" distL="0" distR="0" wp14:anchorId="683259C1" wp14:editId="0210328B">
-            <wp:extent cx="4350753" cy="3017520"/>
+            <wp:extent cx="5760720" cy="3160774"/>
             <wp:effectExtent l="0" t="0" r="0" b="0"/>
             <wp:docPr id="2" name="Image 2"/>
             <wp:cNvGraphicFramePr>
@@ -3051,7 +3051,7 @@
                   <pic:spPr>
                     <a:xfrm>
                       <a:off x="0" y="0"/>
-                      <a:ext cx="4350753" cy="3017520"/>
+                      <a:ext cx="5760720" cy="3160774"/>
                     </a:xfrm>
                     <a:prstGeom prst="rect">
                       <a:avLst/>
@@ -3104,7 +3104,7 @@
     </w:p>
     <w:p>
       <w:r>
-        <w:t xml:space="preserve">Le protocole OpenFlow permet la séparation du plan de contrôle et du plan de données dans les réseaux en utilisant un contrôleur central, des tables de flux et une communication sécurisée. OpenFlow offre une flexibilité et une interopérabilité améliorées [4]. OpenFlow est jusqu'à nos jours la norme la plus populaire pour l'interface southbound des SDN. Il est standardisé par l’Open Networking Foundation (ONF) et implémenté par de nombreux équipementiers, dont HP (créateur avec Stanford university), Cisco (ACI format propriétaire), IBM, Juniper, NEC et Ericsson. Dans OpenFlow, les décisions de routage sont prises par le contrôleur pour chaque flux de données et poussées dans les switches sous forme de simples instructions de commutation. </w:t>
+        <w:t xml:space="preserve">Le protocole OpenFlow permet la séparation du plan de contrôle et du plan de données dans les réseaux en utilisant un contrôleur central, des tables de flux et une communication sécurisée. OpenFlow offre une flexibilité et une interopérabilité améliorées [4]. OpenFlow est jusqu’à nos jours la norme la plus populaire pour l’interface southbound des SDN. Il est standardisé par l’Open Networking Foundation (ONF) et implémenté par de nombreux équipementiers, dont HP (créateur avec Stanford university), Cisco (ACI format propriétaire), IBM, Juniper, NEC et Ericsson. Dans OpenFlow, les décisions de routage sont prises par le contrôleur pour chaque flux de données et poussées dans les switches sous forme de simples instructions de commutation. </w:t>
       </w:r>
     </w:p>
     <w:p>
@@ -3118,14 +3118,14 @@
     </w:p>
     <w:p>
       <w:r>
-        <w:t xml:space="preserve">Pour définir un chemin de la source à la destination, OpenFlow offre un contrôle programmatique des flux aux administrateurs réseau. Il permet de supprimer la surcharge du traitement des paquets des routeurs pour définir le chemin, et les coûts de gestion du réseau lors de l'escalade d'un réseau. Dans une architecture OpenFlow, l'ensemble du système se compose de nombreux dispositifs compatibles OpenFlow, qui sont gérés par un ou plusieurs contrôleurs OpenFlow. Les dispositifs OpenFlow utilisent une ou plusieurs tables de flux. Un flux pourrait être un ensemble de paquets avec les mêmes ID MAC ou adresses IP, des paquets avec la même balise VLAN ou des paquets arrivant du port [2]. </w:t>
-      </w:r>
-    </w:p>
-    <w:p>
-      <w:r>
-        <w:t xml:space="preserve">La table de flux se compose d'entrées de flux, qui décident comment le paquet sera traité ou transféré pour un flux particulier. Chaque entrée de flux dans la table a trois champs : champ de correspondance (en-tête), champ d'action et champ de statistiques. Dans un commutateur OpenFlow, les paquets passent essentiellement par une série de tables de flux pour trouver leur correspondance exacte. Pour chaque paquet entrant, le commutateur prend la décision de transfert en consultant les entrées de la table de flux, en commençant par la première table et en se terminant soit par une correspondance dans l'une des tables, soit par un échec si aucune règle n'est présente pour le paquet. Une règle de flux peut être définie en combinant différents champs </w:t>
+        <w:t xml:space="preserve">Pour définir un chemin de la source à la destination, OpenFlow offre un contrôle programmatique des flux aux administrateurs réseau. Il permet de supprimer la surcharge du traitement des paquets des routeurs pour définir le chemin, et les coûts de gestion du réseau lors de l’escalade d’un réseau. Dans une architecture OpenFlow, l’ensemble du système se compose de nombreux dispositifs compatibles OpenFlow, qui sont gérés par un ou plusieurs contrôleurs OpenFlow. Les dispositifs OpenFlow utilisent une ou plusieurs tables de flux. Un flux pourrait être un ensemble de paquets avec les mêmes ID MAC ou adresses IP, des paquets avec la même balise VLAN ou des paquets arrivant du port [2]. </w:t>
+      </w:r>
+    </w:p>
+    <w:p>
+      <w:r>
+        <w:t xml:space="preserve">La table de flux se compose d’entrées de flux, qui décident comment le paquet sera traité ou transféré pour un flux particulier. Chaque entrée de flux dans la table a trois champs : champ de correspondance (en-tête), champ d’action et champ de statistiques. Dans un commutateur OpenFlow, les paquets passent essentiellement par une série de tables de flux pour trouver leur correspondance exacte. Pour chaque paquet entrant, le commutateur prend la décision de transfert en consultant les entrées de la table de flux, en commençant par la première table et en se terminant soit par une correspondance dans l’une des tables, soit par un échec si aucune règle n’est présente pour le paquet. Une règle de flux peut être définie en combinant différents champs </w:t>
         <w:lastRenderedPageBreak/>
-        <w:t>de correspondance, tels que le numéro de port, l'adresse IPv4 source ou de destination, l'adresse MAC source ou de destination, etc. S'il n'y a pas une telle entrée dans les tables de flux pour un flux, le paquet sera supprimé. Cependant, en cas de non-correspondance, le commutateur envoie le paquet correspondant au contrôleur. Parfois, le commutateur envoie le paquet non-correspondant au pipeline non-OpenFlow du commutateur [2].</w:t>
+        <w:t>de correspondance, tels que le numéro de port, l’adresse IPv4 source ou de destination, l’adresse MAC source ou de destination, etc. S’il n’y a pas une telle entrée dans les tables de flux pour un flux, le paquet sera supprimé. Cependant, en cas de non-correspondance, le commutateur envoie le paquet correspondant au contrôleur. Parfois, le commutateur envoie le paquet non-correspondant au pipeline non-OpenFlow du commutateur [2].</w:t>
       </w:r>
     </w:p>
     <w:p>
@@ -3138,7 +3138,7 @@
     </w:p>
     <w:p>
       <w:r>
-        <w:t>C'est la partie principale du SDN qui fonctionne entre les dispositifs réseau et diverses applications qui fournissent une interface programmatique au réseau. Un contrôleur SDN a la seule responsabilité de gérer les protocoles réseau, les politiques et d'établir le chemin réseau d'un flux en installant des règles de flux sur les dispositifs réseau [2].</w:t>
+        <w:t>C’est la partie principale du SDN qui fonctionne entre les dispositifs réseau et diverses applications qui fournissent une interface programmatique au réseau. Un contrôleur SDN a la seule responsabilité de gérer les protocoles réseau, les politiques et d’établir le chemin réseau d’un flux en installant des règles de flux sur les dispositifs réseau [2].</w:t>
       </w:r>
     </w:p>
     <w:p>
@@ -3153,7 +3153,7 @@
     </w:p>
     <w:p>
       <w:r>
-        <w:t>Pour pouvoir traverser le réseau, chaque flux doit être approuvé par le contrôleur SDN qui vérifie que la communication est autorisée dans le cadre de la politique réseau de l'entreprise. Si le contrôleur autorise le flux, il calcule l'itinéraire que ce dernier doit suivre et ajoute une entrée correspondante au flux dans tous les commutateurs situés sur le trajet [5].</w:t>
+        <w:t>Pour pouvoir traverser le réseau, chaque flux doit être approuvé par le contrôleur SDN qui vérifie que la communication est autorisée dans le cadre de la politique réseau de l’entreprise. Si le contrôleur autorise le flux, il calcule l’itinéraire que ce dernier doit suivre et ajoute une entrée correspondante au flux dans tous les commutateurs situés sur le trajet [5].</w:t>
       </w:r>
     </w:p>
     <w:p>
@@ -3163,7 +3163,7 @@
         </w:rPr>
         <w:drawing>
           <wp:inline distT="0" distB="0" distL="0" distR="0" wp14:anchorId="575F962B" wp14:editId="719A35B4">
-            <wp:extent cx="5760720" cy="3668395"/>
+            <wp:extent cx="5760720" cy="3160774"/>
             <wp:effectExtent l="0" t="0" r="0" b="8255"/>
             <wp:docPr id="4" name="Image 4"/>
             <wp:cNvGraphicFramePr>
@@ -3185,7 +3185,7 @@
                   <pic:spPr>
                     <a:xfrm>
                       <a:off x="0" y="0"/>
-                      <a:ext cx="5760720" cy="3668395"/>
+                      <a:ext cx="5760720" cy="3160774"/>
                     </a:xfrm>
                     <a:prstGeom prst="rect">
                       <a:avLst/>
@@ -3244,7 +3244,7 @@
         <w:t xml:space="preserve">OpenFlow </w:t>
       </w:r>
       <w:r>
-        <w:t xml:space="preserve">à l'aide de ce protocole. Openflow s'appuie sur le protocole TLS (Transport Layer Security) pour sécuriser les communications issues du plan de contrôle à l'échelle du réseau. Chaque commutateur </w:t>
+        <w:t xml:space="preserve">à l’aide de ce protocole. Openflow s’appuie sur le protocole TLS (Transport Layer Security) pour sécuriser les communications issues du plan de contrôle à l’échelle du réseau. Chaque commutateur </w:t>
       </w:r>
       <w:r>
         <w:rPr>
@@ -3254,7 +3254,7 @@
         <w:t xml:space="preserve">OpenFlow </w:t>
       </w:r>
       <w:r>
-        <w:t xml:space="preserve">se connecte à d'autres commutateurs </w:t>
+        <w:t xml:space="preserve">se connecte à d’autres commutateurs </w:t>
       </w:r>
       <w:r>
         <w:rPr>
@@ -3264,12 +3264,12 @@
         <w:t>OpenFlow</w:t>
       </w:r>
       <w:r>
-        <w:t>. Ils peuvent également se connecter aux périphériques utilisateur qui font partie d'un flux de paquets [5].</w:t>
-      </w:r>
-    </w:p>
-    <w:p>
-      <w:r>
-        <w:t>Sur chaque commutateur, la gestion des flux de paquets est assurée par une série de tables mises en œuvre au niveau du matériel  ou  du firmware. À l'échelle du commutateur, un flux est une séquence de paquets qui correspond à une entrée spécifique dans une table de flux [5].</w:t>
+        <w:t>. Ils peuvent également se connecter aux périphériques utilisateur qui font partie d’un flux de paquets [5].</w:t>
+      </w:r>
+    </w:p>
+    <w:p>
+      <w:r>
+        <w:t>Sur chaque commutateur, la gestion des flux de paquets est assurée par une série de tables mises en œuvre au niveau du matériel  ou  du firmware. À l’échelle du commutateur, un flux est une séquence de paquets qui correspond à une entrée spécifique dans une table de flux [5].</w:t>
       </w:r>
     </w:p>
     <w:p>
@@ -3290,7 +3290,7 @@
         <w:rPr>
           <w:lang w:eastAsia="fr-FR"/>
         </w:rPr>
-        <w:t>Le premier point qui distingue une solution d'une autre est la façon dont les contrôleurs sont interconnectés les uns avec les autres [6].</w:t>
+        <w:t>Le premier point qui distingue une solution d’une autre est la façon dont les contrôleurs sont interconnectés les uns avec les autres [6].</w:t>
       </w:r>
     </w:p>
     <w:p>
@@ -3329,7 +3329,7 @@
         <w:rPr>
           <w:lang w:eastAsia="fr-FR"/>
         </w:rPr>
-        <w:t>Cette architecture présente un seul contrôleur centralisé avec une vue globale du système. C'est l'architecture la plus simple et la plus facile à gérer, mais en même temps, la moins scalable/robuste en raison des problèmes bien connus des architectures centralisées (point de défaillance unique, goulots d'étranglement, partitionnement du réseau, etc.) [6].</w:t>
+        <w:t>Cette architecture présente un seul contrôleur centralisé avec une vue globale du système. C’est l’architecture la plus simple et la plus facile à gérer, mais en même temps, la moins scalable/robuste en raison des problèmes bien connus des architectures centralisées (point de défaillance unique, goulots d’étranglement, partitionnement du réseau, etc.) [6].</w:t>
       </w:r>
     </w:p>
     <w:p>
@@ -3368,7 +3368,7 @@
         <w:rPr>
           <w:lang w:eastAsia="fr-FR"/>
         </w:rPr>
-        <w:t>Architecture de type arbre composée de plusieurs couches de contrôleurs. La plupart des solutions présentent un arbre à deux niveaux consistant en des contrôleurs locaux et un contrôleur « racine ». Comme leurs noms l'indiquent, les contrôleurs locaux gèrent les opérations locales telles que le routage intra-site. À l'opposé, le contrôleur « racine » traite toutes les opérations inter-sites. Alors que les contrôleurs locaux n'ont que leur propre vue locale et ne sont pas conscients de l'existence des autres contrôleurs locaux, le contrôleur racine doit maintenir une connaissance globale de l'infrastructure pour communiquer avec les contrôleurs locaux chaque fois que cela est nécessaire. Bien que cette approche relève le défi de la scalabilité par rapport à l'approche centralisée, elle n'augmente la robustesse que partiellement, car le contrôleur racine reste un point centralisé [6].</w:t>
+        <w:t>Architecture de type arbre composée de plusieurs couches de contrôleurs. La plupart des solutions présentent un arbre à deux niveaux consistant en des contrôleurs locaux et un contrôleur « racine ». Comme leurs noms l’indiquent, les contrôleurs locaux gèrent les opérations locales telles que le routage intra-site. À l’opposé, le contrôleur « racine » traite toutes les opérations inter-sites. Alors que les contrôleurs locaux n’ont que leur propre vue locale et ne sont pas conscients de l’existence des autres contrôleurs locaux, le contrôleur racine doit maintenir une connaissance globale de l’infrastructure pour communiquer avec les contrôleurs locaux chaque fois que cela est nécessaire. Bien que cette approche relève le défi de la scalabilité par rapport à l’approche centralisée, elle n’augmente la robustesse que partiellement, car le contrôleur racine reste un point centralisé [6].</w:t>
       </w:r>
     </w:p>
     <w:p>
@@ -3408,7 +3408,7 @@
           <w:lang w:eastAsia="fr-FR"/>
         </w:rPr>
         <w:lastRenderedPageBreak/>
-        <w:t>Architecture où il y a un contrôleur par site, gérant à la fois les opérations intra et inter-sites. Chaque fois qu'un contrôleur crée ou met à jour une ressource réseau, il diffuse les modifications à tous les autres contrôleurs. De cette manière, les contrôleurs peuvent maintenir une copie à jour de la connaissance globale, agissant ainsi comme une seule entité logique. Ce design se rapproche de la proposition initiale SDN, car plusieurs contrôleurs partagent des informations globales sur le réseau pour se présenter comme un seul contrôleur [6].</w:t>
+        <w:t>Architecture où il y a un contrôleur par site, gérant à la fois les opérations intra et inter-sites. Chaque fois qu’un contrôleur crée ou met à jour une ressource réseau, il diffuse les modifications à tous les autres contrôleurs. De cette manière, les contrôleurs peuvent maintenir une copie à jour de la connaissance globale, agissant ainsi comme une seule entité logique. Ce design se rapproche de la proposition initiale SDN, car plusieurs contrôleurs partagent des informations globales sur le réseau pour se présenter comme un seul contrôleur [6].</w:t>
       </w:r>
     </w:p>
     <w:p>
@@ -3447,7 +3447,7 @@
         <w:rPr>
           <w:lang w:eastAsia="fr-FR"/>
         </w:rPr>
-        <w:t>Architecture similaire à la précédente mais sans communiquer toutes les créations/modifications aux autres contrôleurs. Dans cette approche, les données créées localement restent dans l'instance où elles ont été créées et ne sont partagées avec les autres instances que lorsque cela est nécessaire. Dans ce cas, des communications explicites entre les contrôleurs sont instanciées afin d'échanger des informations techniques pour établir, par exemple, des services inter-sites. Cette façon d'interconnecter les contrôleurs augmente la robustesse par rapport aux déconnexions réseau, car une déconnexion réseau ou une défaillance de nœud n'impacte qu'une sous-partie de l'infrastructure [6].</w:t>
+        <w:t>Architecture similaire à la précédente mais sans communiquer toutes les créations/modifications aux autres contrôleurs. Dans cette approche, les données créées localement restent dans l’instance où elles ont été créées et ne sont partagées avec les autres instances que lorsque cela est nécessaire. Dans ce cas, des communications explicites entre les contrôleurs sont instanciées afin d’échanger des informations techniques pour établir, par exemple, des services inter-sites. Cette façon d’interconnecter les contrôleurs augmente la robustesse par rapport aux déconnexions réseau, car une déconnexion réseau ou une défaillance de nœud n’impacte qu’une sous-partie de l’infrastructure [6].</w:t>
       </w:r>
     </w:p>
     <w:p>
@@ -3486,7 +3486,7 @@
         <w:rPr>
           <w:lang w:eastAsia="fr-FR"/>
         </w:rPr>
-        <w:t>Architecture à deux couches mélangeant les architectures distribuée et hiérarchique. Le plan de contrôle consiste en plusieurs contrôleurs racine à la couche supérieure. Chacun des racines gère plusieurs contrôleurs locaux qui sont en charge de leurs sites respectifs. Ces contrôleurs racine sont organisés de manière distribuée, recueillant des informations sur l'état global du réseau parmi eux.</w:t>
+        <w:t>Architecture à deux couches mélangeant les architectures distribuée et hiérarchique. Le plan de contrôle consiste en plusieurs contrôleurs racine à la couche supérieure. Chacun des racines gère plusieurs contrôleurs locaux qui sont en charge de leurs sites respectifs. Ces contrôleurs racine sont organisés de manière distribuée, recueillant des informations sur l’état global du réseau parmi eux.</w:t>
       </w:r>
     </w:p>
     <w:p>
@@ -3508,7 +3508,7 @@
         <w:lastRenderedPageBreak/>
         <w:drawing>
           <wp:inline distT="0" distB="0" distL="0" distR="0" wp14:anchorId="50669589" wp14:editId="147C9604">
-            <wp:extent cx="5760720" cy="4204335"/>
+            <wp:extent cx="5760720" cy="3160774"/>
             <wp:effectExtent l="0" t="0" r="0" b="5715"/>
             <wp:docPr id="5" name="Image 5"/>
             <wp:cNvGraphicFramePr>
@@ -3530,7 +3530,7 @@
                   <pic:spPr>
                     <a:xfrm>
                       <a:off x="0" y="0"/>
-                      <a:ext cx="5760720" cy="4204335"/>
+                      <a:ext cx="5760720" cy="3160774"/>
                     </a:xfrm>
                     <a:prstGeom prst="rect">
                       <a:avLst/>
@@ -3864,7 +3864,7 @@
     </w:p>
     <w:p>
       <w:r>
-        <w:t>Le cloud computing concerne l'extension d'applications via internet en tant que services, ainsi que le logiciel et la technologie qui soutiennent les centres de données fournissant ces services. Le NIST formalise le cloud computing comme « un modèle pour permettre un accès réseau omniprésent, pratique, à la demande à un pool partagé de ressources de calcul configurables (par exemple, réseaux, serveurs, stockage, applications et services) qui peuvent être rapidement provisionnées et libérées avec un effort de gestion minimal ou une interaction avec le fournisseur de services ». Les caractéristiques essentielles du modèle cloud incluent le self-service à la demande, un accès réseau large, le pooling de ressources, une élasticité rapide et un service mesuré. Une infrastructure cloud englobe logiciel et matériel, étendant les fonctionnalités vitales du modèle cloud [14].</w:t>
+        <w:t>Le cloud computing concerne l’extension d’applications via internet en tant que services, ainsi que le logiciel et la technologie qui soutiennent les centres de données fournissant ces services. Le NIST formalise le cloud computing comme « un modèle pour permettre un accès réseau omniprésent, pratique, à la demande à un pool partagé de ressources de calcul configurables (par exemple, réseaux, serveurs, stockage, applications et services) qui peuvent être rapidement provisionnées et libérées avec un effort de gestion minimal ou une interaction avec le fournisseur de services ». Les caractéristiques essentielles du modèle cloud incluent le self-service à la demande, un accès réseau large, le pooling de ressources, une élasticité rapide et un service mesuré. Une infrastructure cloud englobe logiciel et matériel, étendant les fonctionnalités vitales du modèle cloud [14].</w:t>
       </w:r>
     </w:p>
     <w:p>
@@ -3899,7 +3899,7 @@
         <w:t>Software as a Service (SaaS)</w:t>
       </w:r>
       <w:r>
-        <w:t xml:space="preserve"> : le fournisseur cloud présente aux consommateurs des applications accessibles via l'interface de programme ou un navigateur web, et le consommateur a un contrôle limité sur les applications spécifiques à l'utilisateur. </w:t>
+        <w:t xml:space="preserve"> : le fournisseur cloud présente aux consommateurs des applications accessibles via l’interface de programme ou un navigateur web, et le consommateur a un contrôle limité sur les applications spécifiques à l’utilisateur. </w:t>
       </w:r>
     </w:p>
     <w:p>
@@ -3922,7 +3922,7 @@
         <w:t>Platform as a Service (PaaS)</w:t>
       </w:r>
       <w:r>
-        <w:t xml:space="preserve"> : Sur l'infrastructure cloud, les consommateurs sont autorisés à construire et distribuer des applications. Ils peuvent exercer un contrôle sur les applications déployées mais pas sur l'infrastructure cloud. </w:t>
+        <w:t xml:space="preserve"> : Sur l’infrastructure cloud, les consommateurs sont autorisés à construire et distribuer des applications. Ils peuvent exercer un contrôle sur les applications déployées mais pas sur l’infrastructure cloud. </w:t>
       </w:r>
     </w:p>
     <w:p>
@@ -3952,7 +3952,7 @@
           <w:rFonts w:cs="Times New Roman"/>
           <w:szCs w:val="24"/>
         </w:rPr>
-        <w:t xml:space="preserve"> : Le client est fourni avec des ressources de calcul essentielles vitales pour le traitement, le stockage et le réseautage. L'utilisateur exerce un contrôle sur le stockage, les applications et les systèmes d'exploitation, mais pas sur l'infrastructure cloud.</w:t>
+        <w:t xml:space="preserve"> : Le client est fourni avec des ressources de calcul essentielles vitales pour le traitement, le stockage et le réseautage. L’utilisateur exerce un contrôle sur le stockage, les applications et les systèmes d’exploitation, mais pas sur l’infrastructure cloud.</w:t>
       </w:r>
     </w:p>
     <w:p>
@@ -4025,7 +4025,7 @@
           <w:rFonts w:cs="Times New Roman"/>
           <w:szCs w:val="24"/>
         </w:rPr>
-        <w:t xml:space="preserve"> : la communauté spécifique composée d'organisations qui partagent des préoccupations communes peut fournir une infrastructure cloud pour un usage exclusif disponible sur site ou hors site, gérée par des organisations au sein de la communauté ou par un tiers. </w:t>
+        <w:t xml:space="preserve"> : la communauté spécifique composée d’organisations qui partagent des préoccupations communes peut fournir une infrastructure cloud pour un usage exclusif disponible sur site ou hors site, gérée par des organisations au sein de la communauté ou par un tiers. </w:t>
       </w:r>
     </w:p>
     <w:p>
@@ -4054,7 +4054,7 @@
           <w:rFonts w:cs="Times New Roman"/>
           <w:szCs w:val="24"/>
         </w:rPr>
-        <w:t xml:space="preserve"> : le cloud public disponible sur les locaux du fournisseur cloud peut être possédé ou géré par n'importe quelle entreprise et est ouvert à l'usage du grand public.</w:t>
+        <w:t xml:space="preserve"> : le cloud public disponible sur les locaux du fournisseur cloud peut être possédé ou géré par n’importe quelle entreprise et est ouvert à l’usage du grand public.</w:t>
       </w:r>
     </w:p>
     <w:p>
@@ -4083,7 +4083,7 @@
           <w:rFonts w:cs="Times New Roman"/>
           <w:szCs w:val="24"/>
         </w:rPr>
-        <w:t xml:space="preserve"> : il peut être composé de deux ou plus modèles cloud (privé, communautaire ou public) ; bien qu'ils soient des entités distinctes, ils sont liés par une technologie permettant la portabilité des applications ainsi que des données.</w:t>
+        <w:t xml:space="preserve"> : il peut être composé de deux ou plus modèles cloud (privé, communautaire ou public) ; bien qu’ils soient des entités distinctes, ils sont liés par une technologie permettant la portabilité des applications ainsi que des données.</w:t>
       </w:r>
     </w:p>
     <w:p>
@@ -4144,7 +4144,7 @@
     </w:p>
     <w:p>
       <w:r>
-        <w:t>Si un grand nombre d'appareils périphériques sont ajoutés et qu'un grand volume de données terminales est toujours transmis au cloud pour traitement, le volume de transmission de données intermédiaires sera considérablement augmenté, les performances de transmission de données seront réduites, entraînant une charge importante de la bande passante de transmission réseau, provoquant un délai de transmission de données. Dans certains scénarios d'application nécessitant un retour en temps réel, tels que le trafic, la surveillance, etc., le Cloud Computing ne pourra pas répondre aux exigences commerciales en temps réel.</w:t>
+        <w:t>Si un grand nombre d’appareils périphériques sont ajoutés et qu’un grand volume de données terminales est toujours transmis au cloud pour traitement, le volume de transmission de données intermédiaires sera considérablement augmenté, les performances de transmission de données seront réduites, entraînant une charge importante de la bande passante de transmission réseau, provoquant un délai de transmission de données. Dans certains scénarios d’application nécessitant un retour en temps réel, tels que le trafic, la surveillance, etc., le Cloud Computing ne pourra pas répondre aux exigences commerciales en temps réel.</w:t>
       </w:r>
     </w:p>
     <w:p>
@@ -4165,7 +4165,7 @@
     <w:p>
       <w:r>
         <w:lastRenderedPageBreak/>
-        <w:t>Par exemple, lors de l'utilisation de diverses applications dans les smartphones, les applications nécessiteront des données utilisateur, y compris des données privées. Il existe un risque élevé de fuite de confidentialité ou d'attaque sur ces données lorsqu'elles sont téléchargées vers le centre cloud.</w:t>
+        <w:t>Par exemple, lors de l’utilisation de diverses applications dans les smartphones, les applications nécessiteront des données utilisateur, y compris des données privées. Il existe un risque élevé de fuite de confidentialité ou d’attaque sur ces données lorsqu’elles sont téléchargées vers le centre cloud.</w:t>
       </w:r>
     </w:p>
     <w:p>
@@ -4180,17 +4180,17 @@
         <w:rPr>
           <w:rStyle w:val="lev"/>
         </w:rPr>
-        <w:t>Consommation d'énergie</w:t>
-      </w:r>
-    </w:p>
-    <w:p>
-      <w:r>
-        <w:t>Le nombre d'appareils intelligents continue d'augmenter, et la consommation d'énergie des centres de données en Chine a augmenté de manière significative. L'amélioration de l'efficacité d'utilisation de la consommation d'énergie du Cloud Computing ne peut pas répondre à la demande croissante de consommation d'énergie des données. La société intelligente en développement rapide aura des exigences plus élevées en matière de consommation d'énergie du Cloud Computing.</w:t>
-      </w:r>
-    </w:p>
-    <w:p>
-      <w:r>
-        <w:t xml:space="preserve">En raison de l'augmentation du volume de données et des exigences croissantes en matière de traitement de données, l’Edge Computing a émergé au moment historique. </w:t>
+        <w:t>Consommation d’énergie</w:t>
+      </w:r>
+    </w:p>
+    <w:p>
+      <w:r>
+        <w:t>Le nombre d’appareils intelligents continue d’augmenter, et la consommation d’énergie des centres de données en Chine a augmenté de manière significative. L’amélioration de l’efficacité d’utilisation de la consommation d’énergie du Cloud Computing ne peut pas répondre à la demande croissante de consommation d’énergie des données. La société intelligente en développement rapide aura des exigences plus élevées en matière de consommation d’énergie du Cloud Computing.</w:t>
+      </w:r>
+    </w:p>
+    <w:p>
+      <w:r>
+        <w:t xml:space="preserve">En raison de l’augmentation du volume de données et des exigences croissantes en matière de traitement de données, l’Edge Computing a émergé au moment historique. </w:t>
       </w:r>
     </w:p>
     <w:p>
@@ -4225,7 +4225,7 @@
           <w:rFonts w:cs="Times New Roman"/>
           <w:szCs w:val="24"/>
         </w:rPr>
-        <w:t>LEdge Computing (EC) ou l'informatique de périphérie est un paradigme informatique distribué qui rapproche les ressources informatiques de la périphérie du réseau, là où les données sont générées et consommées, plutôt que dans des centres de données centralisés. Dans l'informatique de périphérie, les services de traitement, de stockage et de mise en réseau des données sont fournis par des nœuds situés à la périphérie du réseau, tels que des routeurs, des passerelles et des appareils IoT, plutôt que par des serveurs centralisés [11].</w:t>
+        <w:t>LEdge Computing (EC) ou l’informatique de périphérie est un paradigme informatique distribué qui rapproche les ressources informatiques de la périphérie du réseau, là où les données sont générées et consommées, plutôt que dans des centres de données centralisés. Dans l’informatique de périphérie, les services de traitement, de stockage et de mise en réseau des données sont fournis par des nœuds situés à la périphérie du réseau, tels que des routeurs, des passerelles et des appareils IoT, plutôt que par des serveurs centralisés [11].</w:t>
       </w:r>
     </w:p>
     <w:p>
@@ -4261,7 +4261,7 @@
           <w:rFonts w:ascii="Times New Roman" w:hAnsi="Times New Roman" w:cs="Times New Roman"/>
           <w:szCs w:val="24"/>
         </w:rPr>
-        <w:t>Dans les architectures réseau cellulaire, les serveurs sont déployés à proximité de chaque station de base (BS). Les utilisateurs utilisent alors les ressources fournies par les serveurs situés dans la cellule à laquelle ils sont connectés. Ces serveurs effectuent les calculs nécessitant un temps de réponse faibles et en transmettent au Cloud ceux qui nécessitent des ressources plus conséquentes. Une telle architecture est également utile lors du stockage de données et le passage rapide des demandes de l’utilisateur au serveur situé en périphérie du réseau. Si ce réseau ne dispose pas la ressource demandée, la requête est transmise à l'infrastructure Cloud. Lorsque les données sont renvoyées par le Cloud, elles sont mises en cache afin de pouvoir répondre directement aux futures requêtes. Les serveurs situés à la périphérie du réseau ont des ressources moins importantes que celles du Cloud mais suffisantes pour effectuer certains calculs ayant besoin d’une faible latence [12].</w:t>
+        <w:t>Dans les architectures réseau cellulaire, les serveurs sont déployés à proximité de chaque station de base (BS). Les utilisateurs utilisent alors les ressources fournies par les serveurs situés dans la cellule à laquelle ils sont connectés. Ces serveurs effectuent les calculs nécessitant un temps de réponse faibles et en transmettent au Cloud ceux qui nécessitent des ressources plus conséquentes. Une telle architecture est également utile lors du stockage de données et le passage rapide des demandes de l’utilisateur au serveur situé en périphérie du réseau. Si ce réseau ne dispose pas la ressource demandée, la requête est transmise à l’infrastructure Cloud. Lorsque les données sont renvoyées par le Cloud, elles sont mises en cache afin de pouvoir répondre directement aux futures requêtes. Les serveurs situés à la périphérie du réseau ont des ressources moins importantes que celles du Cloud mais suffisantes pour effectuer certains calculs ayant besoin d’une faible latence [12].</w:t>
       </w:r>
     </w:p>
     <w:p>
@@ -4294,14 +4294,14 @@
     </w:p>
     <w:p>
       <w:r>
-        <w:t xml:space="preserve">Le Fog Computing est fréquemment délibéré comme une forme de Edge Computing. Le Fog computing livre littéralement un traitement distribué, un réseau et un potentiel de stockage plus proche de l'utilisateur. Le Fog Computing est plus qu'un simple déploiement du concept de Edge Computing ; c'est le sommet du renforcement des concepts de Edge Computing. Ce n'est pas une extension ou un remplacement du Cloud ; c'est un nouveau paradigme opérant entre l'IoT et le cloud, avec l'intention de soutenir et d'améliorer l'interaction et l'intégration du cloud, de l'edge et de l'IoT [14].  </w:t>
-      </w:r>
-    </w:p>
-    <w:p>
-      <w:r>
-        <w:t xml:space="preserve">Cisco décrit le Fog Computing  comme un ensemble hautement virtualisé qui fournit des services de calcul, de stockage et de réseau entre les centres de données cloud conventionnels et les dispositifs finaux, généralement mais pas exclusivement déployés au bord du réseau. Selon l'OpenFog Consortium, le fog computing est défini comme « une architecture horizontale de niveau système qui distribue des ressources et des services de calcul, de stockage, de contrôle et de réseau n'importe où le long du continuum du Cloud aux Objets, accélérant ainsi la vélocité </w:t>
+        <w:t xml:space="preserve">Le Fog Computing est fréquemment délibéré comme une forme de Edge Computing. Le Fog computing livre littéralement un traitement distribué, un réseau et un potentiel de stockage plus proche de l’utilisateur. Le Fog Computing est plus qu’un simple déploiement du concept de Edge Computing ; c’est le sommet du renforcement des concepts de Edge Computing. Ce n’est pas une extension ou un remplacement du Cloud ; c’est un nouveau paradigme opérant entre l’IoT et le cloud, avec l’intention de soutenir et d’améliorer l’interaction et l’intégration du cloud, de l’edge et de l’IoT [14].  </w:t>
+      </w:r>
+    </w:p>
+    <w:p>
+      <w:r>
+        <w:t xml:space="preserve">Cisco décrit le Fog Computing  comme un ensemble hautement virtualisé qui fournit des services de calcul, de stockage et de réseau entre les centres de données cloud conventionnels et les dispositifs finaux, généralement mais pas exclusivement déployés au bord du réseau. Selon l’OpenFog Consortium, le fog computing est défini comme « une architecture horizontale de niveau système qui distribue des ressources et des services de calcul, de stockage, de contrôle et de réseau n’importe où le long du continuum du Cloud aux Objets, accélérant ainsi la vélocité </w:t>
         <w:lastRenderedPageBreak/>
-        <w:t>de la prise de décision ». Le fog computing adopte une tactique distribuée originaire du modèle de edge computing pour surpasser les limitations de l'approche de cloud computing centralisée, avec des nœuds fog positionnés n'importe où entre le cloud et les dispositifs finaux [14].</w:t>
+        <w:t>de la prise de décision ». Le fog computing adopte une tactique distribuée originaire du modèle de edge computing pour surpasser les limitations de l’approche de cloud computing centralisée, avec des nœuds fog positionnés n’importe où entre le cloud et les dispositifs finaux [14].</w:t>
       </w:r>
     </w:p>
     <w:p>
@@ -4341,7 +4341,7 @@
         <w:rPr>
           <w:lang w:eastAsia="fr-FR"/>
         </w:rPr>
-        <w:t xml:space="preserve">Le MEC est une continuation du calcul mobile via l'edge computing, offrant le calcul et le stockage aux dispositifs mobiles contraints en énergie et ressources [14]. </w:t>
+        <w:t xml:space="preserve">Le MEC est une continuation du calcul mobile via l’edge computing, offrant le calcul et le stockage aux dispositifs mobiles contraints en énergie et ressources [14]. </w:t>
       </w:r>
     </w:p>
     <w:p>
@@ -4355,7 +4355,7 @@
         <w:rPr>
           <w:lang w:eastAsia="fr-FR"/>
         </w:rPr>
-        <w:t>Avec le MEC, un serveur cloud est déployé aux stations de base du réseau cellulaire. Il exécute des tâches telles que l'amélioration de la performance de l'application et la minimisation de la congestion réseau, de l'utilisation de la bande passante et de la latence pour les abonnés qui ne peuvent pas être atteints avec une architecture réseau conventionnelle. Même si les capacités de traitement et de mémoire des dispositifs mobiles s'améliorent, ils ne sont toujours pas suffisants pour gérer des tâches intensives en calcul, ce qui a conduit aux modèles MCC (Mobile Cloud Computing) et MEC. Le MEC réduit considérablement la durée du processus et les exigences énergétiques des dispositifs mobiles en installant des ressources computationnelles proches des stations de base. Comme les stations de base servent de points d'accès cruciaux à plusieurs dispositifs IoT, les dispositifs finaux pourraient être directement servis avec un seul saut via le MEC. Le MEC met en valeur une faible latence, une proximité à l'utilisateur, une conscience de la localisation et une distribution géographique. Cependant, il restreint le besoin d'installer un serveur MEC dédié pour les services MEC. Avec l'augmentation de la demande de ressources au fil du temps, l'évolutivité est un autre défi majeur. Le MEC présente la fiabilité, l'efficacité énergétique et une faible latence adaptées à diverses applications et surpasse le MCC de manière comparable [14].</w:t>
+        <w:t>Avec le MEC, un serveur cloud est déployé aux stations de base du réseau cellulaire. Il exécute des tâches telles que l’amélioration de la performance de l’application et la minimisation de la congestion réseau, de l’utilisation de la bande passante et de la latence pour les abonnés qui ne peuvent pas être atteints avec une architecture réseau conventionnelle. Même si les capacités de traitement et de mémoire des dispositifs mobiles s’améliorent, ils ne sont toujours pas suffisants pour gérer des tâches intensives en calcul, ce qui a conduit aux modèles MCC (Mobile Cloud Computing) et MEC. Le MEC réduit considérablement la durée du processus et les exigences énergétiques des dispositifs mobiles en installant des ressources computationnelles proches des stations de base. Comme les stations de base servent de points d’accès cruciaux à plusieurs dispositifs IoT, les dispositifs finaux pourraient être directement servis avec un seul saut via le MEC. Le MEC met en valeur une faible latence, une proximité à l’utilisateur, une conscience de la localisation et une distribution géographique. Cependant, il restreint le besoin d’installer un serveur MEC dédié pour les services MEC. Avec l’augmentation de la demande de ressources au fil du temps, l’évolutivité est un autre défi majeur. Le MEC présente la fiabilité, l’efficacité énergétique et une faible latence adaptées à diverses applications et surpasse le MCC de manière comparable [14].</w:t>
       </w:r>
     </w:p>
     <w:p>
@@ -4407,7 +4407,7 @@
         <w:lastRenderedPageBreak/>
         <w:drawing>
           <wp:inline distT="0" distB="0" distL="0" distR="0" wp14:anchorId="3573A9E7" wp14:editId="1EA149FC">
-            <wp:extent cx="5760720" cy="3120390"/>
+            <wp:extent cx="5760720" cy="3160774"/>
             <wp:effectExtent l="0" t="0" r="0" b="3810"/>
             <wp:docPr id="7" name="Image 7"/>
             <wp:cNvGraphicFramePr>
@@ -4438,7 +4438,7 @@
                   <pic:spPr bwMode="auto">
                     <a:xfrm>
                       <a:off x="0" y="0"/>
-                      <a:ext cx="5760720" cy="3120390"/>
+                      <a:ext cx="5760720" cy="3160774"/>
                     </a:xfrm>
                     <a:prstGeom prst="rect">
                       <a:avLst/>
@@ -4486,7 +4486,7 @@
     </w:p>
     <w:p>
       <w:r>
-        <w:t xml:space="preserve">L'Edge Computing se compose de trois couches principales : la couche cloud, la couche Edge et la couche dispositifs [15]. </w:t>
+        <w:t xml:space="preserve">L’Edge Computing se compose de trois couches principales : la couche cloud, la couche Edge et la couche dispositifs [15]. </w:t>
       </w:r>
     </w:p>
     <w:p>
@@ -4513,7 +4513,7 @@
         <w:t>couche cloud</w:t>
       </w:r>
       <w:r>
-        <w:t>, qui peut être une infrastructure cloud publique ou privée. Cette couche héberge et exécute les applications gourmandes en calcul que la couche Edge ne peut pas prendre en charge. De plus, elle exécute également les applications chargées d'orchestrer et de gérer les différents nœuds Edge. La charge de travail provenant de la couche Edge sera déchargée vers le cloud et interagira avec lui. Le cloud peut également servir de source principale de stockage selon les besoins.</w:t>
+        <w:t>, qui peut être une infrastructure cloud publique ou privée. Cette couche héberge et exécute les applications gourmandes en calcul que la couche Edge ne peut pas prendre en charge. De plus, elle exécute également les applications chargées d’orchestrer et de gérer les différents nœuds Edge. La charge de travail provenant de la couche Edge sera déchargée vers le cloud et interagira avec lui. Le cloud peut également servir de source principale de stockage selon les besoins.</w:t>
       </w:r>
     </w:p>
     <w:p>
@@ -4526,7 +4526,7 @@
         <w:t>La deuxième couche est la couche Edge</w:t>
       </w:r>
       <w:r>
-        <w:t>. Cette couche se décline en quatre formes d'implémentation courantes : le nœud Edge, le Cloudlet, le Fog Computing et le Mobile Edge Computing (MEC). Ces formes diffèrent toutefois par leur emplacement, leurs fonctionnalités et leur architecture. Les nœuds Edge désignent tout serveur ou passerelle Edge où la fonction EC est réalisée. Ces nœuds peuvent être subdivisés en partitions virtuelles selon les services fournis, par exemple, des nœuds Edge dédiés aux infrastructures de villes intelligentes dans une première partition, des nœuds Edge dédiés aux établissements médicaux dans une autre partition, et ainsi de suite. Chaque partition virtuelle communique avec sa couche de dispositifs respective.</w:t>
+        <w:t>. Cette couche se décline en quatre formes d’implémentation courantes : le nœud Edge, le Cloudlet, le Fog Computing et le Mobile Edge Computing (MEC). Ces formes diffèrent toutefois par leur emplacement, leurs fonctionnalités et leur architecture. Les nœuds Edge désignent tout serveur ou passerelle Edge où la fonction EC est réalisée. Ces nœuds peuvent être subdivisés en partitions virtuelles selon les services fournis, par exemple, des nœuds Edge dédiés aux infrastructures de villes intelligentes dans une première partition, des nœuds Edge dédiés aux établissements médicaux dans une autre partition, et ainsi de suite. Chaque partition virtuelle communique avec sa couche de dispositifs respective.</w:t>
       </w:r>
     </w:p>
     <w:p>
@@ -4539,9 +4539,9 @@
         <w:rPr>
           <w:lang w:eastAsia="fr-FR"/>
         </w:rPr>
-        <w:t xml:space="preserve">Un Cloudlet fonctionne de manière similaire à un Cloud conventionnel en offrant des services de calcul, mais à une échelle réduite et avec des ressources limitées par rapport à un cloud traditionnel. Les utilisateurs sont directement connectés aux autres dispositifs au sein d'un </w:t>
+        <w:t xml:space="preserve">Un Cloudlet fonctionne de manière similaire à un Cloud conventionnel en offrant des services de calcul, mais à une échelle réduite et avec des ressources limitées par rapport à un cloud traditionnel. Les utilisateurs sont directement connectés aux autres dispositifs au sein d’un </w:t>
         <w:lastRenderedPageBreak/>
-        <w:t>cloudlet spécifique, souvent localisé dans une région particulière. Cette spécificité régionale est fréquemment observée dans les dispositifs mobiles, réduisant considérablement la latence des réponses aux requêtes des utilisateurs. De plus, lorsqu'un dispositif mobile se déplace d'une région à une autre, il bascule d'un cloudlet à un autre. Les cloudlets peuvent ainsi être utilisés dans des environnements nécessitant une excellente conscience situationnelle, une prise de décision efficace et une connectivité fiable.</w:t>
+        <w:t>cloudlet spécifique, souvent localisé dans une région particulière. Cette spécificité régionale est fréquemment observée dans les dispositifs mobiles, réduisant considérablement la latence des réponses aux requêtes des utilisateurs. De plus, lorsqu’un dispositif mobile se déplace d’une région à une autre, il bascule d’un cloudlet à un autre. Les cloudlets peuvent ainsi être utilisés dans des environnements nécessitant une excellente conscience situationnelle, une prise de décision efficace et une connectivité fiable.</w:t>
       </w:r>
     </w:p>
     <w:p>
@@ -4554,7 +4554,7 @@
         <w:rPr>
           <w:lang w:eastAsia="fr-FR"/>
         </w:rPr>
-        <w:t>Le MEC correspond à l'EC appliqué aux dispositifs mobiles. Son objectif principal est de réduire la latence et la consommation énergétique des appareils mobiles en leur permettant de délester leurs tâches intensives en calcul vers des serveurs de proximité. Cela est rendu possible grâce à l'intégration de ressources de calcul, de stockage et de réseau avec les stations de base 3G, LTE et 5G.</w:t>
+        <w:t>Le MEC correspond à l’EC appliqué aux dispositifs mobiles. Son objectif principal est de réduire la latence et la consommation énergétique des appareils mobiles en leur permettant de délester leurs tâches intensives en calcul vers des serveurs de proximité. Cela est rendu possible grâce à l’intégration de ressources de calcul, de stockage et de réseau avec les stations de base 3G, LTE et 5G.</w:t>
       </w:r>
     </w:p>
     <w:p>
@@ -4608,7 +4608,7 @@
         </w:rPr>
         <w:drawing>
           <wp:inline distT="0" distB="0" distL="0" distR="0" wp14:anchorId="3E614C8C" wp14:editId="21A4C6FA">
-            <wp:extent cx="5760720" cy="3025140"/>
+            <wp:extent cx="5760720" cy="3160774"/>
             <wp:effectExtent l="0" t="0" r="0" b="3810"/>
             <wp:docPr id="8" name="Image 8"/>
             <wp:cNvGraphicFramePr>
@@ -4630,7 +4630,7 @@
                   <pic:spPr>
                     <a:xfrm>
                       <a:off x="0" y="0"/>
-                      <a:ext cx="5760720" cy="3025140"/>
+                      <a:ext cx="5760720" cy="3160774"/>
                     </a:xfrm>
                     <a:prstGeom prst="rect">
                       <a:avLst/>
@@ -4725,7 +4725,7 @@
         <w:t>Latence réduite</w:t>
       </w:r>
       <w:r>
-        <w:t xml:space="preserve"> : en traitant les données plus près de la périphérie du réseau, l'Edge Computing peut réduire la latence associée à l'envoi de données vers des centres de données centralisés.</w:t>
+        <w:t xml:space="preserve"> : en traitant les données plus près de la périphérie du réseau, l’Edge Computing peut réduire la latence associée à l’envoi de données vers des centres de données centralisés.</w:t>
       </w:r>
     </w:p>
     <w:p>
@@ -4744,7 +4744,7 @@
         <w:t>Fiabilité améliorée</w:t>
       </w:r>
       <w:r>
-        <w:t xml:space="preserve"> : l'Edge Computing peut améliorer la fiabilité des applications en réduisant la dépendance vis-à-vis des centres de données centralisés et des connexions réseau qui les relient.</w:t>
+        <w:t xml:space="preserve"> : l’Edge Computing peut améliorer la fiabilité des applications en réduisant la dépendance vis-à-vis des centres de données centralisés et des connexions réseau qui les relient.</w:t>
       </w:r>
     </w:p>
     <w:p>
@@ -4763,7 +4763,7 @@
         <w:t>Besoins réduits en bande passante</w:t>
       </w:r>
       <w:r>
-        <w:t xml:space="preserve"> : en traitant les données à la périphérie du réseau, l'Edge Computing peut réduire la quantité de données qui doit être envoyée aux centres de données centralisés pour le traitement, ce qui peut réduire les besoins en bande passante.</w:t>
+        <w:t xml:space="preserve"> : en traitant les données à la périphérie du réseau, l’Edge Computing peut réduire la quantité de données qui doit être envoyée aux centres de données centralisés pour le traitement, ce qui peut réduire les besoins en bande passante.</w:t>
       </w:r>
     </w:p>
     <w:p>
@@ -4782,7 +4782,7 @@
         <w:t>Améliorer la sécurité des données</w:t>
       </w:r>
       <w:r>
-        <w:t xml:space="preserve"> : l'Edge Computing permet d'améliorer la sécurité des applications en réduisant la surface d'attaque associée aux centres de données centralisés et aux connexions réseau qui les relient.</w:t>
+        <w:t xml:space="preserve"> : l’Edge Computing permet d’améliorer la sécurité des applications en réduisant la surface d’attaque associée aux centres de données centralisés et aux connexions réseau qui les relient.</w:t>
       </w:r>
     </w:p>
     <w:p>
@@ -4924,9 +4924,9 @@
     </w:p>
     <w:p>
       <w:r>
-        <w:t xml:space="preserve">Les dispositifs d'imagerie médicale, tels que les scanners IRM et CT, pourront générer de grandes quantités de données. L’Edge Computing peut être utilisé pour traiter ces données localement, réduisant ainsi la latence et évitant le transfert massif de données vers des serveurs distants. Les capteurs portables et les dispositifs médicaux IoT une fois implémentés dans un hôpital peuvent bénéficier du Edge Computing en effectuant un traitement préliminaire des données localement, avant de transmettre uniquement les informations pertinentes aux systèmes centraux. Cela permet une surveillance médicale continue et en temps réel des patients, </w:t>
+        <w:t xml:space="preserve">Les dispositifs d’imagerie médicale, tels que les scanners IRM et CT, pourront générer de grandes quantités de données. L’Edge Computing peut être utilisé pour traiter ces données localement, réduisant ainsi la latence et évitant le transfert massif de données vers des serveurs distants. Les capteurs portables et les dispositifs médicaux IoT une fois implémentés dans un hôpital peuvent bénéficier du Edge Computing en effectuant un traitement préliminaire des données localement, avant de transmettre uniquement les informations pertinentes aux systèmes centraux. Cela permet une surveillance médicale continue et en temps réel des patients, </w:t>
         <w:lastRenderedPageBreak/>
-        <w:t>facilitant le diagnostic précoce des conditions médicales et la gestion des maladies chroniques. Les algorithmes d'IA intégrés au Edge Computing peuvent aider à analyser les images médicales en temps réel pour un diagnostic plus rapide et plus précis [17].</w:t>
+        <w:t>facilitant le diagnostic précoce des conditions médicales et la gestion des maladies chroniques. Les algorithmes d’IA intégrés au Edge Computing peuvent aider à analyser les images médicales en temps réel pour un diagnostic plus rapide et plus précis [17].</w:t>
       </w:r>
     </w:p>
     <w:p/>
@@ -5088,7 +5088,7 @@
     </w:p>
     <w:p>
       <w:r>
-        <w:t>L'optimisation réseau désigne l'ensemble des techniques et stratégies utilisées pour améliorer l'efficacité, la performance et la capacité d'un réseau informatique. Elle peut inclure l'amélioration de la gestion de la bande passante, la réduction de la latence et l'optimisation du routage des données. Ces pratiques sont essentielles pour garantir une connexion rapide et fiable, particulièrement dans un contexte où la demande en données ne cesse de croître [18].</w:t>
+        <w:t>L’optimisation réseau désigne l’ensemble des techniques et stratégies utilisées pour améliorer l’efficacité, la performance et la capacité d’un réseau informatique. Elle peut inclure l’amélioration de la gestion de la bande passante, la réduction de la latence et l’optimisation du routage des données. Ces pratiques sont essentielles pour garantir une connexion rapide et fiable, particulièrement dans un contexte où la demande en données ne cesse de croître [18].</w:t>
       </w:r>
     </w:p>
     <w:p>
@@ -5178,7 +5178,7 @@
     </w:p>
     <w:p>
       <w:r>
-        <w:t>Les avancées récentes en matière d'optimisation réseau sont principalement influencées par le développement technologique, y compris l'</w:t>
+        <w:t>Les avancées récentes en matière d’optimisation réseau sont principalement influencées par le développement technologique, y compris l’</w:t>
       </w:r>
       <w:hyperlink r:id="rId13" w:history="1">
         <w:r>
@@ -5191,7 +5191,7 @@
         </w:r>
       </w:hyperlink>
       <w:r>
-        <w:t xml:space="preserve"> (IA), l'apprentissage </w:t>
+        <w:t xml:space="preserve"> (IA), l’apprentissage </w:t>
       </w:r>
       <w:hyperlink r:id="rId14" w:history="1">
         <w:r>
@@ -5204,7 +5204,7 @@
         </w:r>
       </w:hyperlink>
       <w:r>
-        <w:t>, et les technologies de big data. Ces innovations permettent à l'optimisation réseau d'aborder des problèmes de plus grande échelle et plus complexes avec une précision et une efficacité accrues [18].</w:t>
+        <w:t>, et les technologies de big data. Ces innovations permettent à l’optimisation réseau d’aborder des problèmes de plus grande échelle et plus complexes avec une précision et une efficacité accrues [18].</w:t>
       </w:r>
     </w:p>
     <w:p>
@@ -5532,7 +5532,7 @@
           <w:i/>
           <w:iCs/>
         </w:rPr>
-        <w:t xml:space="preserve">l'analyse de l'expression génétique ou la segmentation de la clientèle. </w:t>
+        <w:t xml:space="preserve">l’analyse de l’expression génétique ou la segmentation de la clientèle. </w:t>
       </w:r>
     </w:p>
     <w:p>
@@ -5663,7 +5663,7 @@
     </w:p>
     <w:p>
       <w:r>
-        <w:t xml:space="preserve">Ces algorithmes cherchent à apprendre une fonction qui estime la "valeur" attendue (la récompense future) de prendre une action donnée dans un état donné. L'agent choisit ensuite l'action qui a la plus grande valeur estimée. Parmi ces algorithmes, nous pouvons citer : </w:t>
+        <w:t xml:space="preserve">Ces algorithmes cherchent à apprendre une fonction qui estime la "valeur" attendue (la récompense future) de prendre une action donnée dans un état donné. L’agent choisit ensuite l’action qui a la plus grande valeur estimée. Parmi ces algorithmes, nous pouvons citer : </w:t>
       </w:r>
       <w:r>
         <w:rPr>
@@ -5736,7 +5736,7 @@
         <w:t xml:space="preserve"> </w:t>
       </w:r>
       <w:r>
-        <w:t xml:space="preserve">Contrairement aux algorithmes basés sur la valeur, ceux-ci apprennent directement une "politique" (une fonction qui mappe un état à une action) sans passer par l'estimation </w:t>
+        <w:t xml:space="preserve">Contrairement aux algorithmes basés sur la valeur, ceux-ci apprennent directement une "politique" (une fonction qui mappe un état à une action) sans passer par l’estimation </w:t>
       </w:r>
       <w:r>
         <w:rPr>
@@ -5745,7 +5745,7 @@
           <w:sz w:val="23"/>
           <w:szCs w:val="23"/>
         </w:rPr>
-        <w:t xml:space="preserve">de la valeur. L'objectif est d'ajuster les paramètres de la politique pour maximiser la récompense. On peut citer : </w:t>
+        <w:t xml:space="preserve">de la valeur. L’objectif est d’ajuster les paramètres de la politique pour maximiser la récompense. On peut citer : </w:t>
       </w:r>
       <w:r>
         <w:rPr>
@@ -5856,7 +5856,7 @@
         </w:rPr>
       </w:pPr>
       <w:r>
-        <w:t>Ces défis peuvent notamment être surmontés en exploitant la puissance de l'apprentissage automatique (ML), qui intègre des prises de décision intelligentes en temps réel et des capacités prédictives dans les environnements SDN. Certaines études récentes ont démontré comment l'utilisation pratique de techniques basées sur le ML peut améliorer les flux de trafic, minimiser la congestion et accroître la qualité de service (QoS) [25].</w:t>
+        <w:t>Ces défis peuvent notamment être surmontés en exploitant la puissance de l’apprentissage automatique (ML), qui intègre des prises de décision intelligentes en temps réel et des capacités prédictives dans les environnements SDN. Certaines études récentes ont démontré comment l’utilisation pratique de techniques basées sur le ML peut améliorer les flux de trafic, minimiser la congestion et accroître la qualité de service (QoS) [25].</w:t>
       </w:r>
     </w:p>
     <w:p>
@@ -5907,7 +5907,7 @@
     </w:p>
     <w:p>
       <w:r>
-        <w:t>Concevoir et évaluer un système d'optimisation dynamique d'une architecture SDN décentralisée dans un environnement Cloud-Edge distribué, en exploitant des techniques de Machine Learning pour améliorer les performances réseau.</w:t>
+        <w:t>Concevoir et évaluer un système d’optimisation dynamique d’une architecture SDN décentralisée dans un environnement Cloud-Edge distribué, en exploitant des techniques de Machine Learning pour améliorer les performances réseau.</w:t>
       </w:r>
     </w:p>
     <w:p>
@@ -5985,7 +5985,7 @@
         <w:t>inefficacités des mécanismes statiques</w:t>
       </w:r>
       <w:r>
-        <w:t xml:space="preserve"> de placement et d'association des contrôleurs</w:t>
+        <w:t xml:space="preserve"> de placement et d’association des contrôleurs</w:t>
       </w:r>
     </w:p>
     <w:p>
@@ -5997,7 +5997,7 @@
         </w:numPr>
       </w:pPr>
       <w:r>
-        <w:t xml:space="preserve">Évaluer l'impact de la </w:t>
+        <w:t xml:space="preserve">Évaluer l’impact de la </w:t>
       </w:r>
       <w:r>
         <w:rPr>
@@ -6006,7 +6006,7 @@
         <w:t>mobilité des nœuds</w:t>
       </w:r>
       <w:r>
-        <w:t xml:space="preserve"> sur la stabilité de l'architecture SDN</w:t>
+        <w:t xml:space="preserve"> sur la stabilité de l’architecture SDN</w:t>
       </w:r>
     </w:p>
     <w:p/>
@@ -6015,7 +6015,7 @@
         <w:pStyle w:val="Titre5"/>
       </w:pPr>
       <w:r>
-        <w:t>2. Modéliser l'architecture SDN décentralisée Cloud-Edge</w:t>
+        <w:t>2. Modéliser l’architecture SDN décentralisée Cloud-Edge</w:t>
       </w:r>
     </w:p>
     <w:p>
@@ -6099,7 +6099,7 @@
         <w:t>flux de trafic</w:t>
       </w:r>
       <w:r>
-        <w:t xml:space="preserve"> entre les différentes couches de l'architecture</w:t>
+        <w:t xml:space="preserve"> entre les différentes couches de l’architecture</w:t>
       </w:r>
     </w:p>
     <w:p/>
@@ -6108,7 +6108,7 @@
         <w:pStyle w:val="Titre5"/>
       </w:pPr>
       <w:r>
-        <w:t>3. Développer un mécanisme d'équilibrage de charge intelligent basé sur le Machine Learning</w:t>
+        <w:t>3. Développer un mécanisme d’équilibrage de charge intelligent basé sur le Machine Learning</w:t>
       </w:r>
     </w:p>
     <w:p>
@@ -6168,7 +6168,7 @@
         <w:rPr>
           <w:rStyle w:val="lev"/>
         </w:rPr>
-        <w:t>mécanisme d'allocation dynamique</w:t>
+        <w:t>mécanisme d’allocation dynamique</w:t>
       </w:r>
       <w:r>
         <w:t xml:space="preserve"> des requêtes aux contrôleurs selon leur charge</w:t>
@@ -6183,7 +6183,7 @@
         </w:numPr>
       </w:pPr>
       <w:r>
-        <w:t xml:space="preserve">Adapter les algorithmes d'ordonnancement (Round Robin, aléatoire, pondéré) en fonction des </w:t>
+        <w:t xml:space="preserve">Adapter les algorithmes d’ordonnancement (Round Robin, aléatoire, pondéré) en fonction des </w:t>
       </w:r>
       <w:r>
         <w:rPr>
@@ -6232,7 +6232,7 @@
         </w:numPr>
       </w:pPr>
       <w:r>
-        <w:t>Intégrer des techniques d'</w:t>
+        <w:t>Intégrer des techniques d’</w:t>
       </w:r>
       <w:r>
         <w:rPr>
@@ -6313,7 +6313,7 @@
         <w:t>prévision du trafic</w:t>
       </w:r>
       <w:r>
-        <w:t xml:space="preserve"> (court terme et long terme) à l'aide de réseaux de neurones ou de modèles LSTM</w:t>
+        <w:t xml:space="preserve"> (court terme et long terme) à l’aide de réseaux de neurones ou de modèles LSTM</w:t>
       </w:r>
     </w:p>
     <w:p>
@@ -6384,7 +6384,7 @@
         <w:pStyle w:val="Titre5"/>
       </w:pPr>
       <w:r>
-        <w:t>6. Réduire la latence de bout en bout dans l'environnement Cloud-Edge</w:t>
+        <w:t>6. Réduire la latence de bout en bout dans l’environnement Cloud-Edge</w:t>
       </w:r>
     </w:p>
     <w:p>
@@ -6477,7 +6477,7 @@
         <w:pStyle w:val="Titre5"/>
       </w:pPr>
       <w:r>
-        <w:t>7. Assurer la scalabilité et la résilience de l'architecture</w:t>
+        <w:t>7. Assurer la scalabilité et la résilience de l’architecture</w:t>
       </w:r>
     </w:p>
     <w:p>
@@ -6495,7 +6495,7 @@
         <w:rPr>
           <w:rStyle w:val="lev"/>
         </w:rPr>
-        <w:t>s'adapter automatiquement</w:t>
+        <w:t>s’adapter automatiquement</w:t>
       </w:r>
       <w:r>
         <w:t xml:space="preserve"> à une augmentation du nombre de nœuds Edge</w:t>
@@ -9300,12 +9300,12 @@
     </w:p>
     <w:p>
       <w:r>
-        <w:t>Le SDN_CTRLML-Edge est une architecture SDN décentralisée basée sur EMA et K-means++ pour les environnements Cloud-Edge distribués. Contrairement aux approches traditionnelles basées sur une association statique entre les équipements réseau et les contrôleurs SDN, SDN_CTRLML-Edge conserve le principe de l'architecture sans liaison (Bindingless Architecture) et introduit un mécanisme intelligent de prise de décision reposant sur l'algorithme K-means++ et la moyenne mobile exponentielle (EMA).</w:t>
-      </w:r>
-    </w:p>
-    <w:p>
-      <w:r>
-        <w:t>L'objectif principal de cette architecture est d'améliorer l'utilisation des ressources Edge, de réduire la surcharge des nœuds, de minimiser les temps de réponse des services et d'assurer une meilleure répartition de la charge dans un environnement distribué.</w:t>
+        <w:t>Le SDN_CTRLML-Edge est une architecture SDN décentralisée basée sur EMA et K-means++ pour les environnements Cloud-Edge distribués. Contrairement aux approches traditionnelles basées sur une association statique entre les équipements réseau et les contrôleurs SDN, SDN_CTRLML-Edge conserve le principe de l’architecture sans liaison (Bindingless Architecture) et introduit un mécanisme intelligent de prise de décision reposant sur l’algorithme K-means++ et la moyenne mobile exponentielle (EMA).</w:t>
+      </w:r>
+    </w:p>
+    <w:p>
+      <w:r>
+        <w:t>L’objectif principal de cette architecture est d’améliorer l’utilisation des ressources Edge, de réduire la surcharge des nœuds, de minimiser les temps de réponse des services et d’assurer une meilleure répartition de la charge dans un environnement distribué.</w:t>
       </w:r>
     </w:p>
     <w:p>
@@ -9322,7 +9322,7 @@
     </w:p>
     <w:p>
       <w:r>
-        <w:t>L'architecture proposée est composée de quatre couches principales :</w:t>
+        <w:t>L’architecture proposée est composée de quatre couches principales :</w:t>
       </w:r>
     </w:p>
     <w:p>
@@ -9493,7 +9493,7 @@
         </w:numPr>
       </w:pPr>
       <w:r>
-        <w:t>l'allocation des ressources ;</w:t>
+        <w:t>l’allocation des ressources ;</w:t>
       </w:r>
     </w:p>
     <w:p>
@@ -9505,12 +9505,12 @@
         </w:numPr>
       </w:pPr>
       <w:r>
-        <w:t>l'équilibrage de charge local.</w:t>
-      </w:r>
-    </w:p>
-    <w:p>
-      <w:r>
-        <w:t>Contrairement aux architectures SDN distribuées classiques, aucun contrôleur central n'est responsable de l'ensemble du réseau. Chaque contrôleur prend ses décisions de manière autonome tout en échangeant périodiquement des informations résumées avec les autres domaines.</w:t>
+        <w:t>l’équilibrage de charge local.</w:t>
+      </w:r>
+    </w:p>
+    <w:p>
+      <w:r>
+        <w:t>Contrairement aux architectures SDN distribuées classiques, aucun contrôleur central n’est responsable de l’ensemble du réseau. Chaque contrôleur prend ses décisions de manière autonome tout en échangeant périodiquement des informations résumées avec les autres domaines.</w:t>
       </w:r>
     </w:p>
     <w:p>
@@ -9532,7 +9532,7 @@
           <w:bCs/>
           <w:color w:val="2F5496" w:themeColor="accent1" w:themeShade="BF"/>
         </w:rPr>
-        <w:t>Couche d'Analyse Intelligente</w:t>
+        <w:t>Couche d’Analyse Intelligente</w:t>
       </w:r>
     </w:p>
     <w:p>
@@ -9590,7 +9590,7 @@
         </w:numPr>
       </w:pPr>
       <w:r>
-        <w:t>réduire l'influence des fluctuations momentanées ;</w:t>
+        <w:t>réduire l’influence des fluctuations momentanées ;</w:t>
       </w:r>
     </w:p>
     <w:p>
@@ -9766,7 +9766,7 @@
     </w:p>
     <w:p>
       <w:r>
-        <w:t>Cette classification est continuellement mise à jour afin de refléter l'évolution du trafic réseau.</w:t>
+        <w:t>Cette classification est continuellement mise à jour afin de refléter l’évolution du trafic réseau.</w:t>
       </w:r>
     </w:p>
     <w:p>
@@ -9793,7 +9793,7 @@
     </w:p>
     <w:p>
       <w:r>
-        <w:t>Cette couche exploite les résultats du clustering afin de prendre des décisions d'optimisation. Les principales décisions concernent :</w:t>
+        <w:t>Cette couche exploite les résultats du clustering afin de prendre des décisions d’optimisation. Les principales décisions concernent :</w:t>
       </w:r>
     </w:p>
     <w:p>
@@ -9817,7 +9817,7 @@
         </w:numPr>
       </w:pPr>
       <w:r>
-        <w:t>l'affectation des flux ;</w:t>
+        <w:t>l’affectation des flux ;</w:t>
       </w:r>
     </w:p>
     <w:p>
@@ -9841,7 +9841,7 @@
         </w:numPr>
       </w:pPr>
       <w:r>
-        <w:t>l'équilibrage des ressources ;</w:t>
+        <w:t>l’équilibrage des ressources ;</w:t>
       </w:r>
     </w:p>
     <w:p>
@@ -9853,7 +9853,7 @@
         </w:numPr>
       </w:pPr>
       <w:r>
-        <w:t>l'optimisation des chemins de communication.</w:t>
+        <w:t>l’optimisation des chemins de communication.</w:t>
       </w:r>
     </w:p>
     <w:p>
@@ -9888,7 +9888,7 @@
         </w:rPr>
         <w:drawing>
           <wp:inline distT="0" distB="0" distL="0" distR="0">
-            <wp:extent cx="5486400" cy="3333079"/>
+            <wp:extent cx="5760720" cy="3160774"/>
             <wp:effectExtent l="0" t="0" r="0" b="0"/>
             <wp:docPr id="2003" name="Figure 16 Pipeline" descr="Pipeline de fonctionnement en cinq étapes : collecte, EMA, K-means++, décision, action"/>
             <wp:cNvGraphicFramePr>
@@ -9910,7 +9910,7 @@
                   <pic:spPr>
                     <a:xfrm>
                       <a:off x="0" y="0"/>
-                      <a:ext cx="5486400" cy="3333079"/>
+                      <a:ext cx="5760720" cy="3160774"/>
                     </a:xfrm>
                     <a:prstGeom prst="rect">
                       <a:avLst/>
@@ -9954,7 +9954,7 @@
     </w:p>
     <w:p>
       <w:r>
-        <w:t>Contrairement à SDN_CTRLML, qui se limite au choix d'un contrôleur, la couche décisionnelle de SDN_CTRLML-Edge prend une décision adaptée à la situation observée dans le domaine Edge. Le tableau 2 récapitule les principales situations et les décisions associées.</w:t>
+        <w:t>Contrairement à SDN_CTRLML, qui se limite au choix d’un contrôleur, la couche décisionnelle de SDN_CTRLML-Edge prend une décision adaptée à la situation observée dans le domaine Edge. Le tableau 2 récapitule les principales situations et les décisions associées.</w:t>
       </w:r>
     </w:p>
     <w:tbl>
@@ -10307,12 +10307,12 @@
         <w:t>instables par nature</w:t>
       </w:r>
       <w:r>
-        <w:t>, un pic de CPU à t=5s peut être un artefact momentané, pas une tendance réelle. Envoyer ces valeurs brutes à K-means++ produirait des clusters instables et incohérents. Ces valeurs collectées sont traitées à l'aide de la moyenne mobile exponentielle (EMA)</w:t>
-      </w:r>
-    </w:p>
-    <w:p>
-      <w:r>
-        <w:t>Cette étape permet d'obtenir des indicateurs représentatifs de l'état réel du système tout en éliminant les variations transitoires.</w:t>
+        <w:t>, un pic de CPU à t=5s peut être un artefact momentané, pas une tendance réelle. Envoyer ces valeurs brutes à K-means++ produirait des clusters instables et incohérents. Ces valeurs collectées sont traitées à l’aide de la moyenne mobile exponentielle (EMA)</w:t>
+      </w:r>
+    </w:p>
+    <w:p>
+      <w:r>
+        <w:t>Cette étape permet d’obtenir des indicateurs représentatifs de l’état réel du système tout en éliminant les variations transitoires.</w:t>
       </w:r>
     </w:p>
     <w:p>
@@ -10600,7 +10600,7 @@
         <w:t>α</w:t>
       </w:r>
       <w:r>
-        <w:t xml:space="preserve"> contrôle l'équilibre entre réactivité et stabilité :</w:t>
+        <w:t xml:space="preserve"> contrôle l’équilibre entre réactivité et stabilité :</w:t>
       </w:r>
     </w:p>
     <w:p>
@@ -10762,7 +10762,7 @@
           <w:b/>
           <w:bCs/>
         </w:rPr>
-        <w:t>Vecteur de sortie de l'EMA</w:t>
+        <w:t>Vecteur de sortie de l’EMA</w:t>
       </w:r>
     </w:p>
     <w:p>
@@ -10971,7 +10971,7 @@
         <w:pStyle w:val="font-claude-response-body"/>
       </w:pPr>
       <w:r>
-        <w:t>C'est ce vecteur, stable et représentatif qui est transmis à K-means++.</w:t>
+        <w:t>C’est ce vecteur, stable et représentatif qui est transmis à K-means++.</w:t>
       </w:r>
     </w:p>
     <w:p>
@@ -10999,7 +10999,7 @@
     </w:p>
     <w:p>
       <w:r>
-        <w:t>K-means++ reçoit l'ensemble des vecteurs EMA de tous les nœuds du domaine :</w:t>
+        <w:t>K-means++ reçoit l’ensemble des vecteurs EMA de tous les nœuds du domaine :</w:t>
       </w:r>
     </w:p>
     <w:p>
@@ -11132,12 +11132,12 @@
     </w:p>
     <w:p>
       <w:r>
-        <w:t>Résultat : les centroïdes initiaux couvrent bien l'espace des profils de charge.</w:t>
-      </w:r>
-    </w:p>
-    <w:p>
-      <w:r>
-        <w:t>Phase 2 : Itérations jusqu'à convergence</w:t>
+        <w:t>Résultat : les centroïdes initiaux couvrent bien l’espace des profils de charge.</w:t>
+      </w:r>
+    </w:p>
+    <w:p>
+      <w:r>
+        <w:t>Phase 2 : Itérations jusqu’à convergence</w:t>
       </w:r>
     </w:p>
     <w:p>
@@ -11191,7 +11191,7 @@
     <w:p>
       <w:r>
         <w:lastRenderedPageBreak/>
-        <w:t>JUSQU'À : stabilité des centroïdes</w:t>
+        <w:t>JUSQU’À : stabilité des centroïdes</w:t>
       </w:r>
     </w:p>
     <w:p>
@@ -11219,7 +11219,7 @@
           <w:b/>
           <w:bCs/>
         </w:rPr>
-        <w:t xml:space="preserve"> : Analyse de l'état du domaine Edge</w:t>
+        <w:t xml:space="preserve"> : Analyse de l’état du domaine Edge</w:t>
       </w:r>
     </w:p>
     <w:p>
@@ -11561,7 +11561,7 @@
         <w:t xml:space="preserve">Mécanisme de décision : </w:t>
       </w:r>
       <w:r>
-        <w:t xml:space="preserve">après la classification, le contrôleur SDN dispose d'une </w:t>
+        <w:t xml:space="preserve">après la classification, le contrôleur SDN dispose d’une </w:t>
       </w:r>
       <w:r>
         <w:rPr>
@@ -11569,7 +11569,7 @@
           <w:b w:val="0"/>
           <w:bCs w:val="0"/>
         </w:rPr>
-        <w:t>carte dynamique de l'état du domaine</w:t>
+        <w:t>carte dynamique de l’état du domaine</w:t>
       </w:r>
       <w:r>
         <w:t>. Il raisonne en trois étapes :</w:t>
@@ -11621,7 +11621,7 @@
         </w:rPr>
         <w:drawing>
           <wp:inline distT="0" distB="0" distL="0" distR="0" wp14:anchorId="54C32CF9" wp14:editId="5EA13295">
-            <wp:extent cx="3383280" cy="364358"/>
+            <wp:extent cx="5760720" cy="3160774"/>
             <wp:effectExtent l="0" t="0" r="0" b="0"/>
             <wp:docPr id="6" name="Image 6"/>
             <wp:cNvGraphicFramePr>
@@ -11643,7 +11643,7 @@
                   <pic:spPr>
                     <a:xfrm>
                       <a:off x="0" y="0"/>
-                      <a:ext cx="3383280" cy="364358"/>
+                      <a:ext cx="5760720" cy="3160774"/>
                     </a:xfrm>
                     <a:prstGeom prst="rect">
                       <a:avLst/>
@@ -11696,7 +11696,7 @@
         </w:rPr>
         <w:drawing>
           <wp:inline distT="0" distB="0" distL="0" distR="0" wp14:anchorId="691E6E12" wp14:editId="4F71909D">
-            <wp:extent cx="3383280" cy="354267"/>
+            <wp:extent cx="5760720" cy="3160774"/>
             <wp:effectExtent l="0" t="0" r="0" b="8255"/>
             <wp:docPr id="9" name="Image 9"/>
             <wp:cNvGraphicFramePr>
@@ -11718,7 +11718,7 @@
                   <pic:spPr>
                     <a:xfrm>
                       <a:off x="0" y="0"/>
-                      <a:ext cx="3383280" cy="354267"/>
+                      <a:ext cx="5760720" cy="3160774"/>
                     </a:xfrm>
                     <a:prstGeom prst="rect">
                       <a:avLst/>
@@ -11762,7 +11762,7 @@
         </w:rPr>
         <w:drawing>
           <wp:inline distT="0" distB="0" distL="0" distR="0" wp14:anchorId="52C5BC56" wp14:editId="06D71F44">
-            <wp:extent cx="2103120" cy="428664"/>
+            <wp:extent cx="5760720" cy="3160774"/>
             <wp:effectExtent l="0" t="0" r="0" b="9525"/>
             <wp:docPr id="10" name="Image 10"/>
             <wp:cNvGraphicFramePr>
@@ -11784,7 +11784,7 @@
                   <pic:spPr>
                     <a:xfrm>
                       <a:off x="0" y="0"/>
-                      <a:ext cx="2103120" cy="428664"/>
+                      <a:ext cx="5760720" cy="3160774"/>
                     </a:xfrm>
                     <a:prstGeom prst="rect">
                       <a:avLst/>
@@ -11800,7 +11800,7 @@
     <w:p>
       <w:r>
         <w:lastRenderedPageBreak/>
-        <w:t xml:space="preserve">C'est le nœud </w:t>
+        <w:t xml:space="preserve">C’est le nœud </w:t>
       </w:r>
       <w:r>
         <w:rPr>
@@ -11829,7 +11829,7 @@
         </w:rPr>
         <w:drawing>
           <wp:inline distT="0" distB="0" distL="0" distR="0">
-            <wp:extent cx="4114800" cy="2850800"/>
+            <wp:extent cx="5760720" cy="3160774"/>
             <wp:effectExtent l="0" t="0" r="0" b="0"/>
             <wp:docPr id="2004" name="Figure 17 Decision" descr="Schéma de la prise de décision en trois étapes A, B, C"/>
             <wp:cNvGraphicFramePr>
@@ -11851,7 +11851,7 @@
                   <pic:spPr>
                     <a:xfrm>
                       <a:off x="0" y="0"/>
-                      <a:ext cx="4114800" cy="2850800"/>
+                      <a:ext cx="5760720" cy="3160774"/>
                     </a:xfrm>
                     <a:prstGeom prst="rect">
                       <a:avLst/>
@@ -11928,7 +11928,7 @@
     </w:p>
     <w:p>
       <w:r>
-        <w:t>Le processus est exécuté périodiquement afin de s'adapter aux variations du trafic et aux changements de charge.</w:t>
+        <w:t>Le processus est exécuté périodiquement afin de s’adapter aux variations du trafic et aux changements de charge.</w:t>
       </w:r>
     </w:p>
     <w:p>
@@ -11945,7 +11945,7 @@
     </w:p>
     <w:p>
       <w:r>
-        <w:t>La règle de sélection présentée à l'Étape C (nœud le plus proche du profil requis) est volontairement formulée de façon générale pour illustrer le principe. Son implémentation logicielle (module de décision du simulateur) la précise sous la forme d'une règle à deux régimes, retenue après une phase de vérification de cohérence menée à plusieurs taux d'arrivée (4 000, 16 000 et 32 000 requêtes/s) : une préférence systématique pour le contrôleur le plus proche, même parmi des contrôleurs seulement partiellement chargés, conduisait à saturer les petits contrôleurs Edge avant de solliciter les nœuds Fog/Cloud, un comportement contraire à l'objectif d'équilibrage.</w:t>
+        <w:t>La règle de sélection présentée à l’Étape C (nœud le plus proche du profil requis) est volontairement formulée de façon générale pour illustrer le principe. Son implémentation logicielle (module de décision du simulateur) la précise sous la forme d’une règle à deux régimes, retenue après une phase de vérification de cohérence menée à plusieurs taux d’arrivée (4 000, 16 000 et 32 000 requêtes/s) : une préférence systématique pour le contrôleur le plus proche, même parmi des contrôleurs seulement partiellement chargés, conduisait à saturer les petits contrôleurs Edge avant de solliciter les nœuds Fog/Cloud, un comportement contraire à l’objectif d’équilibrage.</w:t>
       </w:r>
     </w:p>
     <w:p>
@@ -11957,7 +11957,7 @@
         <w:t xml:space="preserve">Régime normal : </w:t>
       </w:r>
       <w:r>
-        <w:t>parmi les contrôleurs qui ne figurent pas dans le cluster K-means++ jugé surchargé et dont la charge CPU individuelle reste sous un seuil absolu (0,70), le contrôleur retenu est le plus proche en latence réseau (arrondie à la milliseconde ; en deçà, la mesure n'est que du bruit) ; les ex æquo sont départagés par la charge la plus faible.</w:t>
+        <w:t>parmi les contrôleurs qui ne figurent pas dans le cluster K-means++ jugé surchargé et dont la charge CPU individuelle reste sous un seuil absolu (0,70), le contrôleur retenu est le plus proche en latence réseau (arrondie à la milliseconde ; en deçà, la mesure n’est que du bruit) ; les ex æquo sont départagés par la charge la plus faible.</w:t>
       </w:r>
     </w:p>
     <w:p>
@@ -11969,12 +11969,12 @@
         <w:t xml:space="preserve">Régime saturé : </w:t>
       </w:r>
       <w:r>
-        <w:t>si aucun contrôleur ne satisfait ce critère de santé (par exemple lors d'un pic de charge généralisé), le mécanisme bascule vers un délestage pur : le flux est envoyé au contrôleur de charge la plus faible, sans tenir compte de la latence. Ce second régime traduit l'idée que, lorsque tous les contrôleurs approchent la saturation, le temps d'attente en file domine largement le temps de propagation réseau ; s'obstiner sur la proximité reviendrait alors à concentrer davantage la charge sur un nœud déjà critique.</w:t>
-      </w:r>
-    </w:p>
-    <w:p>
-      <w:r>
-        <w:t>Formellement, pour un flux dont le commutateur source est src, et Ω l'ensemble des contrôleurs candidats (hors cluster surchargé) :</w:t>
+        <w:t>si aucun contrôleur ne satisfait ce critère de santé (par exemple lors d’un pic de charge généralisé), le mécanisme bascule vers un délestage pur : le flux est envoyé au contrôleur de charge la plus faible, sans tenir compte de la latence. Ce second régime traduit l’idée que, lorsque tous les contrôleurs approchent la saturation, le temps d’attente en file domine largement le temps de propagation réseau ; s’obstiner sur la proximité reviendrait alors à concentrer davantage la charge sur un nœud déjà critique.</w:t>
+      </w:r>
+    </w:p>
+    <w:p>
+      <w:r>
+        <w:t>Formellement, pour un flux dont le commutateur source est src, et Ω l’ensemble des contrôleurs candidats (hors cluster surchargé) :</w:t>
       </w:r>
     </w:p>
     <w:p>
@@ -11989,7 +11989,7 @@
       <w:r>
         <w:drawing>
           <wp:inline distT="0" distB="0" distL="0" distR="0">
-            <wp:extent cx="3931920" cy="4865875"/>
+            <wp:extent cx="5760720" cy="3160774"/>
             <wp:effectExtent l="0" t="0" r="0" b="0"/>
             <wp:docPr id="2001" name="Diagramme décision" descr="Diagramme du logigramme de décision à deux régimes"/>
             <wp:cNvGraphicFramePr>
@@ -12011,7 +12011,7 @@
                   <pic:spPr>
                     <a:xfrm>
                       <a:off x="0" y="0"/>
-                      <a:ext cx="3931920" cy="4865875"/>
+                      <a:ext cx="5760720" cy="3160774"/>
                     </a:xfrm>
                     <a:prstGeom prst="rect">
                       <a:avLst/>
@@ -12054,7 +12054,7 @@
     </w:p>
     <w:p>
       <w:r>
-        <w:t>La fonction charge(c) est mise à jour de façon incrémentale après chaque flux, et non uniquement en fin d'époque (200 flux), afin d'éviter un effet de troupeau où l'ensemble d'une époque serait dirigé vers le même contrôleur avant que son estimation de charge ne soit rafraîchie ; un piège identifié lors de la comparaison avec la baseline SDN_CTRLML, dont l'implémentation d'origine ne réévalue la charge qu'à chaque ré-exécution du K-means++.</w:t>
+        <w:t>La fonction charge(c) est mise à jour de façon incrémentale après chaque flux, et non uniquement en fin d’époque (200 flux), afin d’éviter un effet de troupeau où l’ensemble d’une époque serait dirigé vers le même contrôleur avant que son estimation de charge ne soit rafraîchie ; un piège identifié lors de la comparaison avec la baseline SDN_CTRLML, dont l’implémentation d’origine ne réévalue la charge qu’à chaque ré-exécution du K-means++.</w:t>
       </w:r>
     </w:p>
     <w:p>
@@ -12071,7 +12071,7 @@
     </w:p>
     <w:p>
       <w:r>
-        <w:t>L'évaluation de SDN_CTRLML-Edge repose sur trois familles de métriques, détaillées ci-dessous : une métrique de qualité du clustering, des métriques opérationnelles mesurées lors de la simulation, et un protocole statistique garantissant la significativité des comparaisons entre stratégies.</w:t>
+        <w:t>L’évaluation de SDN_CTRLML-Edge repose sur trois familles de métriques, détaillées ci-dessous : une métrique de qualité du clustering, des métriques opérationnelles mesurées lors de la simulation, et un protocole statistique garantissant la significativité des comparaisons entre stratégies.</w:t>
       </w:r>
     </w:p>
     <w:p>
@@ -12097,12 +12097,12 @@
           <w:sz w:val="28"/>
           <w:szCs w:val="24"/>
         </w:rPr>
-        <w:t>Métrique d'évaluation du clustering (K-means++)</w:t>
-      </w:r>
-    </w:p>
-    <w:p>
-      <w:r>
-        <w:t>Le choix de K = 3 (sous-utilisé / normal / surchargé) n'est pas arbitraire : il est validé empiriquement par le score de silhouette (fonction silhouette_score de scikit-learn), qui mesure pour chaque point la cohésion à son propre cluster relativement à la séparation avec le cluster le plus proche (valeur comprise entre -1 et 1 ; un score proche de 1 indique des clusters bien séparés). Ce score est recalculé à chaque ré-exécution du K-means++ (toutes les 200 affectations de flux) et journalisé ; il permet de vérifier que les trois profils de charge restent statistiquement distincts tout au long de la simulation, et pas seulement au moment de leur initialisation.</w:t>
+        <w:t>Métrique d’évaluation du clustering (K-means++)</w:t>
+      </w:r>
+    </w:p>
+    <w:p>
+      <w:r>
+        <w:t>Le choix de K = 3 (sous-utilisé / normal / surchargé) n’est pas arbitraire : il est validé empiriquement par le score de silhouette (fonction silhouette_score de scikit-learn), qui mesure pour chaque point la cohésion à son propre cluster relativement à la séparation avec le cluster le plus proche (valeur comprise entre -1 et 1 ; un score proche de 1 indique des clusters bien séparés). Ce score est recalculé à chaque ré-exécution du K-means++ (toutes les 200 affectations de flux) et journalisé ; il permet de vérifier que les trois profils de charge restent statistiquement distincts tout au long de la simulation, et pas seulement au moment de leur initialisation.</w:t>
       </w:r>
     </w:p>
     <w:p>
@@ -12133,7 +12133,7 @@
     </w:p>
     <w:p>
       <w:r>
-        <w:t>Pour chaque simulation, les métriques suivantes sont mesurées et moyennées sur l'ensemble des flux (ou des contrôleurs) :</w:t>
+        <w:t>Pour chaque simulation, les métriques suivantes sont mesurées et moyennées sur l’ensemble des flux (ou des contrôleurs) :</w:t>
       </w:r>
     </w:p>
     <w:p>
@@ -12152,7 +12152,7 @@
         <w:t xml:space="preserve">Temps de réponse moyen (ms) : </w:t>
       </w:r>
       <w:r>
-        <w:t>somme de la latence réseau (plus court chemin sur la topologie, calculé avec NetworkX) et du délai d'attente en file M/M/1, (1000/μc)/(1−ρc), du contrôleur retenu ;</w:t>
+        <w:t>somme de la latence réseau (plus court chemin sur la topologie, calculé avec NetworkX) et du délai d’attente en file M/M/1, (1000/μc)/(1−ρc), du contrôleur retenu ;</w:t>
       </w:r>
     </w:p>
     <w:p>
@@ -12171,7 +12171,7 @@
         <w:t xml:space="preserve">Débit (flux servis/s) : </w:t>
       </w:r>
       <w:r>
-        <w:t>proportion de flux traités sans que le contrôleur cible n'atteigne la saturation (ρ ≥ 0,999) ;</w:t>
+        <w:t>proportion de flux traités sans que le contrôleur cible n’atteigne la saturation (ρ ≥ 0,999) ;</w:t>
       </w:r>
     </w:p>
     <w:p>
@@ -12206,7 +12206,7 @@
           <w:b/>
           <w:bCs/>
         </w:rPr>
-        <w:t xml:space="preserve">Indice d'équité de Jain : </w:t>
+        <w:t xml:space="preserve">Indice d’équité de Jain : </w:t>
       </w:r>
       <w:r>
         <w:t>mesure la répartition de la charge entre contrôleurs : J(x) = (Σxi)² / (n·Σxi²), bornée entre 1/n (charge concentrée sur un seul contrôleur) et 1 (charge parfaitement égale entre les n contrôleurs) ;</w:t>
@@ -12228,7 +12228,7 @@
         <w:t xml:space="preserve">Coût de migration : </w:t>
       </w:r>
       <w:r>
-        <w:t>nombre de réaffectations d'un commutateur source vers un contrôleur différent de celui utilisé lors de sa précédente affectation.</w:t>
+        <w:t>nombre de réaffectations d’un commutateur source vers un contrôleur différent de celui utilisé lors de sa précédente affectation.</w:t>
       </w:r>
     </w:p>
     <w:p>
@@ -12259,7 +12259,7 @@
     </w:p>
     <w:p>
       <w:r>
-        <w:t>Un run isolé ne permet pas de conclure : la charge de fond, la topologie et le trafic comportent une part d'aléa. Pour rendre les résultats défendables, chaque combinaison (stratégie, taux d'arrivée) est répétée sur 25 graines aléatoires (seeds) indépendantes, qui font varier conjointement la topologie, la charge de fond et le trafic, et pas seulement le bruit d'un même scénario. Deux traitements statistiques sont appliqués (bibliothèque SciPy, sous-module stats) :</w:t>
+        <w:t>Un run isolé ne permet pas de conclure : la charge de fond, la topologie et le trafic comportent une part d’aléa. Pour rendre les résultats défendables, chaque combinaison (stratégie, taux d’arrivée) est répétée sur 25 graines aléatoires (seeds) indépendantes, qui font varier conjointement la topologie, la charge de fond et le trafic, et pas seulement le bruit d’un même scénario. Deux traitements statistiques sont appliqués (bibliothèque SciPy, sous-module stats) :</w:t>
       </w:r>
     </w:p>
     <w:p>
@@ -12271,7 +12271,7 @@
         </w:numPr>
       </w:pPr>
       <w:r>
-        <w:t>un intervalle de confiance à 95 % (loi de Student) est calculé pour chaque métrique, par stratégie et par taux d'arrivée ;</w:t>
+        <w:t>un intervalle de confiance à 95 % (loi de Student) est calculé pour chaque métrique, par stratégie et par taux d’arrivée ;</w:t>
       </w:r>
     </w:p>
     <w:p>
@@ -12298,12 +12298,12 @@
         <w:pStyle w:val="Titre1"/>
       </w:pPr>
       <w:r>
-        <w:t>Données réutilisées et plan d'expériences</w:t>
-      </w:r>
-    </w:p>
-    <w:p>
-      <w:r>
-        <w:t>Conformément au principe de réutilisation retenu pour ce travail (s'appuyer sur des données et des outils existants plutôt que de tout générer), trois jeux de données réels alimentent, ou peuvent alimenter, le simulateur :</w:t>
+        <w:t>Données réutilisées et plan d’expériences</w:t>
+      </w:r>
+    </w:p>
+    <w:p>
+      <w:r>
+        <w:t>Conformément au principe de réutilisation retenu pour ce travail (s’appuyer sur des données et des outils existants plutôt que de tout générer), trois jeux de données réels alimentent, ou peuvent alimenter, le simulateur :</w:t>
       </w:r>
     </w:p>
     <w:p>
@@ -12322,7 +12322,7 @@
         <w:t xml:space="preserve">Alibaba Cluster Trace </w:t>
       </w:r>
       <w:r>
-        <w:t>(trace server_usage, github.com/alibaba/clusterdata) : séries temporelles réelles d'utilisation CPU et mémoire sur un parc de machines hétérogènes, utilisées pour calibrer la charge de fond des contrôleurs ;</w:t>
+        <w:t>(trace server_usage, github.com/alibaba/clusterdata) : séries temporelles réelles d’utilisation CPU et mémoire sur un parc de machines hétérogènes, utilisées pour calibrer la charge de fond des contrôleurs ;</w:t>
       </w:r>
     </w:p>
     <w:p>
@@ -12360,12 +12360,12 @@
         <w:t xml:space="preserve">Internet Topology Zoo </w:t>
       </w:r>
       <w:r>
-        <w:t>(topology-zoo.org) : plus de 250 topologies réelles d'opérateurs au format GraphML avec coordonnées géographiques, utilisées pour construire la topologie réseau et les latences commutateur-contrôleur (plus court chemin, NetworkX).</w:t>
-      </w:r>
-    </w:p>
-    <w:p>
-      <w:r>
-        <w:t>Chaque chargeur de données accepte le fichier réel s'il est déposé dans le dossier de données du projet ; en son absence, il retombe sur un générateur synthétique calibré sur les ordres de grandeur publiés de ces jeux de données, ce qui garantit un pipeline exécutable hors ligne. À la date de rédaction, les 1 000 simulations rapportées au chapitre suivant ont été produites avec ce repli synthétique : le raccordement aux fichiers réels est une étape de robustesse supplémentaire, pas un prérequis au fonctionnement du pipeline, mais constitue une limite explicitement assumée des résultats actuels.</w:t>
+        <w:t>(topology-zoo.org) : plus de 250 topologies réelles d’opérateurs au format GraphML avec coordonnées géographiques, utilisées pour construire la topologie réseau et les latences commutateur-contrôleur (plus court chemin, NetworkX).</w:t>
+      </w:r>
+    </w:p>
+    <w:p>
+      <w:r>
+        <w:t>Chaque chargeur de données accepte le fichier réel s’il est déposé dans le dossier de données du projet ; en son absence, il retombe sur un générateur synthétique calibré sur les ordres de grandeur publiés de ces jeux de données, ce qui garantit un pipeline exécutable hors ligne. À la date de rédaction, les 1 000 simulations rapportées au chapitre suivant ont été produites avec ce repli synthétique : le raccordement aux fichiers réels est une étape de robustesse supplémentaire, pas un prérequis au fonctionnement du pipeline, mais constitue une limite explicitement assumée des résultats actuels.</w:t>
       </w:r>
     </w:p>
     <w:p>
@@ -12375,7 +12375,7 @@
           <w:bCs/>
           <w:u w:val="single"/>
         </w:rPr>
-        <w:t>Plan d'expériences (Design of Experiments)</w:t>
+        <w:t>Plan d’expériences (Design of Experiments)</w:t>
       </w:r>
     </w:p>
     <w:p>
@@ -12390,7 +12390,7 @@
       <w:r>
         <w:drawing>
           <wp:inline distT="0" distB="0" distL="0" distR="0">
-            <wp:extent cx="3657600" cy="4887504"/>
+            <wp:extent cx="5760720" cy="3160774"/>
             <wp:effectExtent l="0" t="0" r="0" b="0"/>
             <wp:docPr id="2002" name="Diagramme pipeline" descr="Diagramme du pipeline expérimental complet, des données à l'analyse statistique"/>
             <wp:cNvGraphicFramePr>
@@ -12412,7 +12412,7 @@
                   <pic:spPr>
                     <a:xfrm>
                       <a:off x="0" y="0"/>
-                      <a:ext cx="3657600" cy="4887504"/>
+                      <a:ext cx="5760720" cy="3160774"/>
                     </a:xfrm>
                     <a:prstGeom prst="rect">
                       <a:avLst/>
@@ -12456,17 +12456,17 @@
     </w:p>
     <w:p>
       <w:r>
-        <w:t>L'évaluation croise 5 stratégies (SDN_CTRLML-Edge, ONOS statique, SDN_CTRLML, Round-Robin, Random) × 8 taux d'arrivée (de 2 000 à 32 000 requêtes/s) × 25 graines aléatoires, soit 1 000 simulations indépendantes de 6 000 flux chacune. Ces exécutions étant indépendantes, elles sont parallélisées avec la bibliothèque joblib sur l'ensemble des cœurs de la machine (8 cœurs dans notre environnement), chaque worker étant limité à un seul thread BLAS/OpenMP pour éviter la sur-souscription.</w:t>
-      </w:r>
-    </w:p>
-    <w:p>
-      <w:r>
-        <w:t>Ce choix a été préféré à un orchestrateur de type Airflow ou à un moteur de calcul distribué comme Spark : la charge de travail (des simulations Python indépendantes sur une seule machine) se parallélise trivialement sur les cœurs disponibles, sans qu'un cluster ou un ordonnanceur dédié n'apporte de bénéfice proportionné à sa complexité opérationnelle. La rigueur des conclusions vient du multi-seed et du protocole statistique, pas d'une infrastructure de calcul distribué.</w:t>
-      </w:r>
-    </w:p>
-    <w:p>
-      <w:r>
-        <w:t>Chaque exécution est journalisée dans MLflow (paramètres et métriques), avec un backend de suivi SQLite, le magasin de fichiers utilisé par défaut par MLflow ayant été déprécié à partir de la version 3. Cela permet d'explorer les 1 000 runs via l'interface MLflow sans dépendance à un serveur de tracking externe.</w:t>
+        <w:t>L’évaluation croise 5 stratégies (SDN_CTRLML-Edge, ONOS statique, SDN_CTRLML, Round-Robin, Random) × 8 taux d’arrivée (de 2 000 à 32 000 requêtes/s) × 25 graines aléatoires, soit 1 000 simulations indépendantes de 6 000 flux chacune. Ces exécutions étant indépendantes, elles sont parallélisées avec la bibliothèque joblib sur l’ensemble des cœurs de la machine (8 cœurs dans notre environnement), chaque worker étant limité à un seul thread BLAS/OpenMP pour éviter la sur-souscription.</w:t>
+      </w:r>
+    </w:p>
+    <w:p>
+      <w:r>
+        <w:t>Ce choix a été préféré à un orchestrateur de type Airflow ou à un moteur de calcul distribué comme Spark : la charge de travail (des simulations Python indépendantes sur une seule machine) se parallélise trivialement sur les cœurs disponibles, sans qu’un cluster ou un ordonnanceur dédié n’apporte de bénéfice proportionné à sa complexité opérationnelle. La rigueur des conclusions vient du multi-seed et du protocole statistique, pas d’une infrastructure de calcul distribué.</w:t>
+      </w:r>
+    </w:p>
+    <w:p>
+      <w:r>
+        <w:t>Chaque exécution est journalisée dans MLflow (paramètres et métriques), avec un backend de suivi SQLite, le magasin de fichiers utilisé par défaut par MLflow ayant été déprécié à partir de la version 3. Cela permet d’explorer les 1 000 runs via l’interface MLflow sans dépendance à un serveur de tracking externe.</w:t>
       </w:r>
     </w:p>
     <w:p>
@@ -12612,7 +12612,7 @@
               <w:ind w:firstLine="0"/>
             </w:pPr>
             <w:r>
-              <w:t>Système d'exploitation</w:t>
+              <w:t>Système d’exploitation</w:t>
             </w:r>
           </w:p>
         </w:tc>
@@ -13210,7 +13210,7 @@
     <w:p/>
     <w:p>
       <w:r>
-        <w:t>Aucune de ces briques n'a été redéveloppée : chacune correspond à une bibliothèque de référence de l'écosystème scientifique Python, conformément au principe de réutilisation retenu pour ce travail. Le seul moteur ad hoc du projet est la simulation elle-même : une file M/M/1 par contrôleur, plus simple et suffisante pour ce périmètre qu'un moteur à événements discrets complet (tel que SimPy), qui resterait pertinent si le protocole expérimental venait à intégrer des dépendances entre flux ou des files d'attente plus réalistes.</w:t>
+        <w:t>Aucune de ces briques n’a été redéveloppée : chacune correspond à une bibliothèque de référence de l’écosystème scientifique Python, conformément au principe de réutilisation retenu pour ce travail. Le seul moteur ad hoc du projet est la simulation elle-même : une file M/M/1 par contrôleur, plus simple et suffisante pour ce périmètre qu’un moteur à événements discrets complet (tel que SimPy), qui resterait pertinent si le protocole expérimental venait à intégrer des dépendances entre flux ou des files d’attente plus réalistes.</w:t>
       </w:r>
     </w:p>
     <w:p>

</xml_diff>